<commit_message>
Split the hands-on guide into per-chapter Word files
- deliverables/操作手冊_分章/: chapters 1–7 and appendices A–B as 9 standalone DOCX files
- guide.js now builds the combined guide and the split files from the same content
- README lists the split files and the updated build command

Co-Authored-By: Claude Opus 5.5 <noreply@anthropic.com>
</commit_message>
<xml_diff>
--- a/deliverables/Power_On_雪梨_實作與演練操作手冊.docx
+++ b/deliverables/Power_On_雪梨_實作與演練操作手冊.docx
@@ -624,7 +624,7 @@
     <w:sdt>
       <w:sdtPr>
         <w:alias w:val="目錄"/>
-        <w:id w:val="-1735618721"/>
+        <w:id w:val="733975395"/>
       </w:sdtPr>
       <w:sdtEndPr>
         <w:rPr>
@@ -663,7 +663,7 @@
           <w:r>
             <w:fldChar w:fldCharType="separate"/>
           </w:r>
-          <w:hyperlink w:anchor="_Toc243961168" w:history="1">
+          <w:hyperlink w:anchor="_Toc243962767" w:history="1">
             <w:r>
               <w:rPr>
                 <w:rStyle w:val="a5"/>
@@ -701,7 +701,7 @@
               <w:rPr>
                 <w:noProof/>
               </w:rPr>
-              <w:instrText xml:space="preserve"> PAGEREF _Toc243961168 \h </w:instrText>
+              <w:instrText xml:space="preserve"> PAGEREF _Toc243962767 \h </w:instrText>
             </w:r>
             <w:r>
               <w:rPr>
@@ -744,7 +744,7 @@
               <w14:ligatures w14:val="standardContextual"/>
             </w:rPr>
           </w:pPr>
-          <w:hyperlink w:anchor="_Toc243961169" w:history="1">
+          <w:hyperlink w:anchor="_Toc243962768" w:history="1">
             <w:r>
               <w:rPr>
                 <w:rStyle w:val="a5"/>
@@ -775,7 +775,7 @@
               <w:rPr>
                 <w:noProof/>
               </w:rPr>
-              <w:instrText xml:space="preserve"> PAGEREF _Toc243961169 \h </w:instrText>
+              <w:instrText xml:space="preserve"> PAGEREF _Toc243962768 \h </w:instrText>
             </w:r>
             <w:r>
               <w:rPr>
@@ -818,7 +818,7 @@
               <w14:ligatures w14:val="standardContextual"/>
             </w:rPr>
           </w:pPr>
-          <w:hyperlink w:anchor="_Toc243961170" w:history="1">
+          <w:hyperlink w:anchor="_Toc243962769" w:history="1">
             <w:r>
               <w:rPr>
                 <w:rStyle w:val="a5"/>
@@ -849,7 +849,7 @@
               <w:rPr>
                 <w:noProof/>
               </w:rPr>
-              <w:instrText xml:space="preserve"> PAGEREF _Toc243961170 \h </w:instrText>
+              <w:instrText xml:space="preserve"> PAGEREF _Toc243962769 \h </w:instrText>
             </w:r>
             <w:r>
               <w:rPr>
@@ -894,7 +894,7 @@
               <w14:ligatures w14:val="standardContextual"/>
             </w:rPr>
           </w:pPr>
-          <w:hyperlink w:anchor="_Toc243961171" w:history="1">
+          <w:hyperlink w:anchor="_Toc243962770" w:history="1">
             <w:r>
               <w:rPr>
                 <w:rStyle w:val="a5"/>
@@ -932,7 +932,7 @@
               <w:rPr>
                 <w:noProof/>
               </w:rPr>
-              <w:instrText xml:space="preserve"> PAGEREF _Toc243961171 \h </w:instrText>
+              <w:instrText xml:space="preserve"> PAGEREF _Toc243962770 \h </w:instrText>
             </w:r>
             <w:r>
               <w:rPr>
@@ -975,7 +975,7 @@
               <w14:ligatures w14:val="standardContextual"/>
             </w:rPr>
           </w:pPr>
-          <w:hyperlink w:anchor="_Toc243961172" w:history="1">
+          <w:hyperlink w:anchor="_Toc243962771" w:history="1">
             <w:r>
               <w:rPr>
                 <w:rStyle w:val="a5"/>
@@ -1006,7 +1006,7 @@
               <w:rPr>
                 <w:noProof/>
               </w:rPr>
-              <w:instrText xml:space="preserve"> PAGEREF _Toc243961172 \h </w:instrText>
+              <w:instrText xml:space="preserve"> PAGEREF _Toc243962771 \h </w:instrText>
             </w:r>
             <w:r>
               <w:rPr>
@@ -1049,7 +1049,7 @@
               <w14:ligatures w14:val="standardContextual"/>
             </w:rPr>
           </w:pPr>
-          <w:hyperlink w:anchor="_Toc243961173" w:history="1">
+          <w:hyperlink w:anchor="_Toc243962772" w:history="1">
             <w:r>
               <w:rPr>
                 <w:rStyle w:val="a5"/>
@@ -1080,7 +1080,7 @@
               <w:rPr>
                 <w:noProof/>
               </w:rPr>
-              <w:instrText xml:space="preserve"> PAGEREF _Toc243961173 \h </w:instrText>
+              <w:instrText xml:space="preserve"> PAGEREF _Toc243962772 \h </w:instrText>
             </w:r>
             <w:r>
               <w:rPr>
@@ -1123,7 +1123,7 @@
               <w14:ligatures w14:val="standardContextual"/>
             </w:rPr>
           </w:pPr>
-          <w:hyperlink w:anchor="_Toc243961174" w:history="1">
+          <w:hyperlink w:anchor="_Toc243962773" w:history="1">
             <w:r>
               <w:rPr>
                 <w:rStyle w:val="a5"/>
@@ -1154,7 +1154,7 @@
               <w:rPr>
                 <w:noProof/>
               </w:rPr>
-              <w:instrText xml:space="preserve"> PAGEREF _Toc243961174 \h </w:instrText>
+              <w:instrText xml:space="preserve"> PAGEREF _Toc243962773 \h </w:instrText>
             </w:r>
             <w:r>
               <w:rPr>
@@ -1197,7 +1197,7 @@
               <w14:ligatures w14:val="standardContextual"/>
             </w:rPr>
           </w:pPr>
-          <w:hyperlink w:anchor="_Toc243961175" w:history="1">
+          <w:hyperlink w:anchor="_Toc243962774" w:history="1">
             <w:r>
               <w:rPr>
                 <w:rStyle w:val="a5"/>
@@ -1228,7 +1228,7 @@
               <w:rPr>
                 <w:noProof/>
               </w:rPr>
-              <w:instrText xml:space="preserve"> PAGEREF _Toc243961175 \h </w:instrText>
+              <w:instrText xml:space="preserve"> PAGEREF _Toc243962774 \h </w:instrText>
             </w:r>
             <w:r>
               <w:rPr>
@@ -1271,7 +1271,7 @@
               <w14:ligatures w14:val="standardContextual"/>
             </w:rPr>
           </w:pPr>
-          <w:hyperlink w:anchor="_Toc243961176" w:history="1">
+          <w:hyperlink w:anchor="_Toc243962775" w:history="1">
             <w:r>
               <w:rPr>
                 <w:rStyle w:val="a5"/>
@@ -1316,7 +1316,7 @@
               <w:rPr>
                 <w:noProof/>
               </w:rPr>
-              <w:instrText xml:space="preserve"> PAGEREF _Toc243961176 \h </w:instrText>
+              <w:instrText xml:space="preserve"> PAGEREF _Toc243962775 \h </w:instrText>
             </w:r>
             <w:r>
               <w:rPr>
@@ -1359,7 +1359,7 @@
               <w14:ligatures w14:val="standardContextual"/>
             </w:rPr>
           </w:pPr>
-          <w:hyperlink w:anchor="_Toc243961177" w:history="1">
+          <w:hyperlink w:anchor="_Toc243962776" w:history="1">
             <w:r>
               <w:rPr>
                 <w:rStyle w:val="a5"/>
@@ -1390,7 +1390,7 @@
               <w:rPr>
                 <w:noProof/>
               </w:rPr>
-              <w:instrText xml:space="preserve"> PAGEREF _Toc243961177 \h </w:instrText>
+              <w:instrText xml:space="preserve"> PAGEREF _Toc243962776 \h </w:instrText>
             </w:r>
             <w:r>
               <w:rPr>
@@ -1433,7 +1433,7 @@
               <w14:ligatures w14:val="standardContextual"/>
             </w:rPr>
           </w:pPr>
-          <w:hyperlink w:anchor="_Toc243961178" w:history="1">
+          <w:hyperlink w:anchor="_Toc243962777" w:history="1">
             <w:r>
               <w:rPr>
                 <w:rStyle w:val="a5"/>
@@ -1464,7 +1464,7 @@
               <w:rPr>
                 <w:noProof/>
               </w:rPr>
-              <w:instrText xml:space="preserve"> PAGEREF _Toc243961178 \h </w:instrText>
+              <w:instrText xml:space="preserve"> PAGEREF _Toc243962777 \h </w:instrText>
             </w:r>
             <w:r>
               <w:rPr>
@@ -1507,7 +1507,7 @@
               <w14:ligatures w14:val="standardContextual"/>
             </w:rPr>
           </w:pPr>
-          <w:hyperlink w:anchor="_Toc243961179" w:history="1">
+          <w:hyperlink w:anchor="_Toc243962778" w:history="1">
             <w:r>
               <w:rPr>
                 <w:rStyle w:val="a5"/>
@@ -1552,7 +1552,7 @@
               <w:rPr>
                 <w:noProof/>
               </w:rPr>
-              <w:instrText xml:space="preserve"> PAGEREF _Toc243961179 \h </w:instrText>
+              <w:instrText xml:space="preserve"> PAGEREF _Toc243962778 \h </w:instrText>
             </w:r>
             <w:r>
               <w:rPr>
@@ -1595,7 +1595,7 @@
               <w14:ligatures w14:val="standardContextual"/>
             </w:rPr>
           </w:pPr>
-          <w:hyperlink w:anchor="_Toc243961180" w:history="1">
+          <w:hyperlink w:anchor="_Toc243962779" w:history="1">
             <w:r>
               <w:rPr>
                 <w:rStyle w:val="a5"/>
@@ -1626,7 +1626,7 @@
               <w:rPr>
                 <w:noProof/>
               </w:rPr>
-              <w:instrText xml:space="preserve"> PAGEREF _Toc243961180 \h </w:instrText>
+              <w:instrText xml:space="preserve"> PAGEREF _Toc243962779 \h </w:instrText>
             </w:r>
             <w:r>
               <w:rPr>
@@ -1669,7 +1669,7 @@
               <w14:ligatures w14:val="standardContextual"/>
             </w:rPr>
           </w:pPr>
-          <w:hyperlink w:anchor="_Toc243961181" w:history="1">
+          <w:hyperlink w:anchor="_Toc243962780" w:history="1">
             <w:r>
               <w:rPr>
                 <w:rStyle w:val="a5"/>
@@ -1700,7 +1700,7 @@
               <w:rPr>
                 <w:noProof/>
               </w:rPr>
-              <w:instrText xml:space="preserve"> PAGEREF _Toc243961181 \h </w:instrText>
+              <w:instrText xml:space="preserve"> PAGEREF _Toc243962780 \h </w:instrText>
             </w:r>
             <w:r>
               <w:rPr>
@@ -1745,7 +1745,7 @@
               <w14:ligatures w14:val="standardContextual"/>
             </w:rPr>
           </w:pPr>
-          <w:hyperlink w:anchor="_Toc243961182" w:history="1">
+          <w:hyperlink w:anchor="_Toc243962781" w:history="1">
             <w:r>
               <w:rPr>
                 <w:rStyle w:val="a5"/>
@@ -1783,7 +1783,7 @@
               <w:rPr>
                 <w:noProof/>
               </w:rPr>
-              <w:instrText xml:space="preserve"> PAGEREF _Toc243961182 \h </w:instrText>
+              <w:instrText xml:space="preserve"> PAGEREF _Toc243962781 \h </w:instrText>
             </w:r>
             <w:r>
               <w:rPr>
@@ -1826,7 +1826,7 @@
               <w14:ligatures w14:val="standardContextual"/>
             </w:rPr>
           </w:pPr>
-          <w:hyperlink w:anchor="_Toc243961183" w:history="1">
+          <w:hyperlink w:anchor="_Toc243962782" w:history="1">
             <w:r>
               <w:rPr>
                 <w:rStyle w:val="a5"/>
@@ -1857,7 +1857,7 @@
               <w:rPr>
                 <w:noProof/>
               </w:rPr>
-              <w:instrText xml:space="preserve"> PAGEREF _Toc243961183 \h </w:instrText>
+              <w:instrText xml:space="preserve"> PAGEREF _Toc243962782 \h </w:instrText>
             </w:r>
             <w:r>
               <w:rPr>
@@ -1900,7 +1900,7 @@
               <w14:ligatures w14:val="standardContextual"/>
             </w:rPr>
           </w:pPr>
-          <w:hyperlink w:anchor="_Toc243961184" w:history="1">
+          <w:hyperlink w:anchor="_Toc243962783" w:history="1">
             <w:r>
               <w:rPr>
                 <w:rStyle w:val="a5"/>
@@ -1931,7 +1931,7 @@
               <w:rPr>
                 <w:noProof/>
               </w:rPr>
-              <w:instrText xml:space="preserve"> PAGEREF _Toc243961184 \h </w:instrText>
+              <w:instrText xml:space="preserve"> PAGEREF _Toc243962783 \h </w:instrText>
             </w:r>
             <w:r>
               <w:rPr>
@@ -1974,7 +1974,7 @@
               <w14:ligatures w14:val="standardContextual"/>
             </w:rPr>
           </w:pPr>
-          <w:hyperlink w:anchor="_Toc243961185" w:history="1">
+          <w:hyperlink w:anchor="_Toc243962784" w:history="1">
             <w:r>
               <w:rPr>
                 <w:rStyle w:val="a5"/>
@@ -2005,7 +2005,7 @@
               <w:rPr>
                 <w:noProof/>
               </w:rPr>
-              <w:instrText xml:space="preserve"> PAGEREF _Toc243961185 \h </w:instrText>
+              <w:instrText xml:space="preserve"> PAGEREF _Toc243962784 \h </w:instrText>
             </w:r>
             <w:r>
               <w:rPr>
@@ -2048,7 +2048,7 @@
               <w14:ligatures w14:val="standardContextual"/>
             </w:rPr>
           </w:pPr>
-          <w:hyperlink w:anchor="_Toc243961186" w:history="1">
+          <w:hyperlink w:anchor="_Toc243962785" w:history="1">
             <w:r>
               <w:rPr>
                 <w:rStyle w:val="a5"/>
@@ -2079,7 +2079,7 @@
               <w:rPr>
                 <w:noProof/>
               </w:rPr>
-              <w:instrText xml:space="preserve"> PAGEREF _Toc243961186 \h </w:instrText>
+              <w:instrText xml:space="preserve"> PAGEREF _Toc243962785 \h </w:instrText>
             </w:r>
             <w:r>
               <w:rPr>
@@ -2122,7 +2122,7 @@
               <w14:ligatures w14:val="standardContextual"/>
             </w:rPr>
           </w:pPr>
-          <w:hyperlink w:anchor="_Toc243961187" w:history="1">
+          <w:hyperlink w:anchor="_Toc243962786" w:history="1">
             <w:r>
               <w:rPr>
                 <w:rStyle w:val="a5"/>
@@ -2153,7 +2153,7 @@
               <w:rPr>
                 <w:noProof/>
               </w:rPr>
-              <w:instrText xml:space="preserve"> PAGEREF _Toc243961187 \h </w:instrText>
+              <w:instrText xml:space="preserve"> PAGEREF _Toc243962786 \h </w:instrText>
             </w:r>
             <w:r>
               <w:rPr>
@@ -2196,7 +2196,7 @@
               <w14:ligatures w14:val="standardContextual"/>
             </w:rPr>
           </w:pPr>
-          <w:hyperlink w:anchor="_Toc243961188" w:history="1">
+          <w:hyperlink w:anchor="_Toc243962787" w:history="1">
             <w:r>
               <w:rPr>
                 <w:rStyle w:val="a5"/>
@@ -2227,7 +2227,7 @@
               <w:rPr>
                 <w:noProof/>
               </w:rPr>
-              <w:instrText xml:space="preserve"> PAGEREF _Toc243961188 \h </w:instrText>
+              <w:instrText xml:space="preserve"> PAGEREF _Toc243962787 \h </w:instrText>
             </w:r>
             <w:r>
               <w:rPr>
@@ -2272,7 +2272,7 @@
               <w14:ligatures w14:val="standardContextual"/>
             </w:rPr>
           </w:pPr>
-          <w:hyperlink w:anchor="_Toc243961189" w:history="1">
+          <w:hyperlink w:anchor="_Toc243962788" w:history="1">
             <w:r>
               <w:rPr>
                 <w:rStyle w:val="a5"/>
@@ -2324,7 +2324,7 @@
               <w:rPr>
                 <w:noProof/>
               </w:rPr>
-              <w:instrText xml:space="preserve"> PAGEREF _Toc243961189 \h </w:instrText>
+              <w:instrText xml:space="preserve"> PAGEREF _Toc243962788 \h </w:instrText>
             </w:r>
             <w:r>
               <w:rPr>
@@ -2367,7 +2367,7 @@
               <w14:ligatures w14:val="standardContextual"/>
             </w:rPr>
           </w:pPr>
-          <w:hyperlink w:anchor="_Toc243961190" w:history="1">
+          <w:hyperlink w:anchor="_Toc243962789" w:history="1">
             <w:r>
               <w:rPr>
                 <w:rStyle w:val="a5"/>
@@ -2398,7 +2398,7 @@
               <w:rPr>
                 <w:noProof/>
               </w:rPr>
-              <w:instrText xml:space="preserve"> PAGEREF _Toc243961190 \h </w:instrText>
+              <w:instrText xml:space="preserve"> PAGEREF _Toc243962789 \h </w:instrText>
             </w:r>
             <w:r>
               <w:rPr>
@@ -2441,7 +2441,7 @@
               <w14:ligatures w14:val="standardContextual"/>
             </w:rPr>
           </w:pPr>
-          <w:hyperlink w:anchor="_Toc243961191" w:history="1">
+          <w:hyperlink w:anchor="_Toc243962790" w:history="1">
             <w:r>
               <w:rPr>
                 <w:rStyle w:val="a5"/>
@@ -2472,7 +2472,7 @@
               <w:rPr>
                 <w:noProof/>
               </w:rPr>
-              <w:instrText xml:space="preserve"> PAGEREF _Toc243961191 \h </w:instrText>
+              <w:instrText xml:space="preserve"> PAGEREF _Toc243962790 \h </w:instrText>
             </w:r>
             <w:r>
               <w:rPr>
@@ -2515,7 +2515,7 @@
               <w14:ligatures w14:val="standardContextual"/>
             </w:rPr>
           </w:pPr>
-          <w:hyperlink w:anchor="_Toc243961192" w:history="1">
+          <w:hyperlink w:anchor="_Toc243962791" w:history="1">
             <w:r>
               <w:rPr>
                 <w:rStyle w:val="a5"/>
@@ -2560,7 +2560,7 @@
               <w:rPr>
                 <w:noProof/>
               </w:rPr>
-              <w:instrText xml:space="preserve"> PAGEREF _Toc243961192 \h </w:instrText>
+              <w:instrText xml:space="preserve"> PAGEREF _Toc243962791 \h </w:instrText>
             </w:r>
             <w:r>
               <w:rPr>
@@ -2603,7 +2603,7 @@
               <w14:ligatures w14:val="standardContextual"/>
             </w:rPr>
           </w:pPr>
-          <w:hyperlink w:anchor="_Toc243961193" w:history="1">
+          <w:hyperlink w:anchor="_Toc243962792" w:history="1">
             <w:r>
               <w:rPr>
                 <w:rStyle w:val="a5"/>
@@ -2634,7 +2634,7 @@
               <w:rPr>
                 <w:noProof/>
               </w:rPr>
-              <w:instrText xml:space="preserve"> PAGEREF _Toc243961193 \h </w:instrText>
+              <w:instrText xml:space="preserve"> PAGEREF _Toc243962792 \h </w:instrText>
             </w:r>
             <w:r>
               <w:rPr>
@@ -2677,7 +2677,7 @@
               <w14:ligatures w14:val="standardContextual"/>
             </w:rPr>
           </w:pPr>
-          <w:hyperlink w:anchor="_Toc243961194" w:history="1">
+          <w:hyperlink w:anchor="_Toc243962793" w:history="1">
             <w:r>
               <w:rPr>
                 <w:rStyle w:val="a5"/>
@@ -2708,7 +2708,7 @@
               <w:rPr>
                 <w:noProof/>
               </w:rPr>
-              <w:instrText xml:space="preserve"> PAGEREF _Toc243961194 \h </w:instrText>
+              <w:instrText xml:space="preserve"> PAGEREF _Toc243962793 \h </w:instrText>
             </w:r>
             <w:r>
               <w:rPr>
@@ -2751,7 +2751,7 @@
               <w14:ligatures w14:val="standardContextual"/>
             </w:rPr>
           </w:pPr>
-          <w:hyperlink w:anchor="_Toc243961195" w:history="1">
+          <w:hyperlink w:anchor="_Toc243962794" w:history="1">
             <w:r>
               <w:rPr>
                 <w:rStyle w:val="a5"/>
@@ -2782,7 +2782,7 @@
               <w:rPr>
                 <w:noProof/>
               </w:rPr>
-              <w:instrText xml:space="preserve"> PAGEREF _Toc243961195 \h </w:instrText>
+              <w:instrText xml:space="preserve"> PAGEREF _Toc243962794 \h </w:instrText>
             </w:r>
             <w:r>
               <w:rPr>
@@ -2827,7 +2827,7 @@
               <w14:ligatures w14:val="standardContextual"/>
             </w:rPr>
           </w:pPr>
-          <w:hyperlink w:anchor="_Toc243961196" w:history="1">
+          <w:hyperlink w:anchor="_Toc243962795" w:history="1">
             <w:r>
               <w:rPr>
                 <w:rStyle w:val="a5"/>
@@ -2879,7 +2879,7 @@
               <w:rPr>
                 <w:noProof/>
               </w:rPr>
-              <w:instrText xml:space="preserve"> PAGEREF _Toc243961196 \h </w:instrText>
+              <w:instrText xml:space="preserve"> PAGEREF _Toc243962795 \h </w:instrText>
             </w:r>
             <w:r>
               <w:rPr>
@@ -2922,7 +2922,7 @@
               <w14:ligatures w14:val="standardContextual"/>
             </w:rPr>
           </w:pPr>
-          <w:hyperlink w:anchor="_Toc243961197" w:history="1">
+          <w:hyperlink w:anchor="_Toc243962796" w:history="1">
             <w:r>
               <w:rPr>
                 <w:rStyle w:val="a5"/>
@@ -2953,7 +2953,7 @@
               <w:rPr>
                 <w:noProof/>
               </w:rPr>
-              <w:instrText xml:space="preserve"> PAGEREF _Toc243961197 \h </w:instrText>
+              <w:instrText xml:space="preserve"> PAGEREF _Toc243962796 \h </w:instrText>
             </w:r>
             <w:r>
               <w:rPr>
@@ -2996,7 +2996,7 @@
               <w14:ligatures w14:val="standardContextual"/>
             </w:rPr>
           </w:pPr>
-          <w:hyperlink w:anchor="_Toc243961198" w:history="1">
+          <w:hyperlink w:anchor="_Toc243962797" w:history="1">
             <w:r>
               <w:rPr>
                 <w:rStyle w:val="a5"/>
@@ -3027,7 +3027,7 @@
               <w:rPr>
                 <w:noProof/>
               </w:rPr>
-              <w:instrText xml:space="preserve"> PAGEREF _Toc243961198 \h </w:instrText>
+              <w:instrText xml:space="preserve"> PAGEREF _Toc243962797 \h </w:instrText>
             </w:r>
             <w:r>
               <w:rPr>
@@ -3070,7 +3070,7 @@
               <w14:ligatures w14:val="standardContextual"/>
             </w:rPr>
           </w:pPr>
-          <w:hyperlink w:anchor="_Toc243961199" w:history="1">
+          <w:hyperlink w:anchor="_Toc243962798" w:history="1">
             <w:r>
               <w:rPr>
                 <w:rStyle w:val="a5"/>
@@ -3101,7 +3101,7 @@
               <w:rPr>
                 <w:noProof/>
               </w:rPr>
-              <w:instrText xml:space="preserve"> PAGEREF _Toc243961199 \h </w:instrText>
+              <w:instrText xml:space="preserve"> PAGEREF _Toc243962798 \h </w:instrText>
             </w:r>
             <w:r>
               <w:rPr>
@@ -3144,7 +3144,7 @@
               <w14:ligatures w14:val="standardContextual"/>
             </w:rPr>
           </w:pPr>
-          <w:hyperlink w:anchor="_Toc243961200" w:history="1">
+          <w:hyperlink w:anchor="_Toc243962799" w:history="1">
             <w:r>
               <w:rPr>
                 <w:rStyle w:val="a5"/>
@@ -3175,7 +3175,7 @@
               <w:rPr>
                 <w:noProof/>
               </w:rPr>
-              <w:instrText xml:space="preserve"> PAGEREF _Toc243961200 \h </w:instrText>
+              <w:instrText xml:space="preserve"> PAGEREF _Toc243962799 \h </w:instrText>
             </w:r>
             <w:r>
               <w:rPr>
@@ -3218,7 +3218,7 @@
               <w14:ligatures w14:val="standardContextual"/>
             </w:rPr>
           </w:pPr>
-          <w:hyperlink w:anchor="_Toc243961201" w:history="1">
+          <w:hyperlink w:anchor="_Toc243962800" w:history="1">
             <w:r>
               <w:rPr>
                 <w:rStyle w:val="a5"/>
@@ -3249,7 +3249,7 @@
               <w:rPr>
                 <w:noProof/>
               </w:rPr>
-              <w:instrText xml:space="preserve"> PAGEREF _Toc243961201 \h </w:instrText>
+              <w:instrText xml:space="preserve"> PAGEREF _Toc243962800 \h </w:instrText>
             </w:r>
             <w:r>
               <w:rPr>
@@ -3294,7 +3294,7 @@
               <w14:ligatures w14:val="standardContextual"/>
             </w:rPr>
           </w:pPr>
-          <w:hyperlink w:anchor="_Toc243961202" w:history="1">
+          <w:hyperlink w:anchor="_Toc243962801" w:history="1">
             <w:r>
               <w:rPr>
                 <w:rStyle w:val="a5"/>
@@ -3360,7 +3360,7 @@
               <w:rPr>
                 <w:noProof/>
               </w:rPr>
-              <w:instrText xml:space="preserve"> PAGEREF _Toc243961202 \h </w:instrText>
+              <w:instrText xml:space="preserve"> PAGEREF _Toc243962801 \h </w:instrText>
             </w:r>
             <w:r>
               <w:rPr>
@@ -3403,7 +3403,7 @@
               <w14:ligatures w14:val="standardContextual"/>
             </w:rPr>
           </w:pPr>
-          <w:hyperlink w:anchor="_Toc243961203" w:history="1">
+          <w:hyperlink w:anchor="_Toc243962802" w:history="1">
             <w:r>
               <w:rPr>
                 <w:rStyle w:val="a5"/>
@@ -3434,7 +3434,7 @@
               <w:rPr>
                 <w:noProof/>
               </w:rPr>
-              <w:instrText xml:space="preserve"> PAGEREF _Toc243961203 \h </w:instrText>
+              <w:instrText xml:space="preserve"> PAGEREF _Toc243962802 \h </w:instrText>
             </w:r>
             <w:r>
               <w:rPr>
@@ -3477,7 +3477,7 @@
               <w14:ligatures w14:val="standardContextual"/>
             </w:rPr>
           </w:pPr>
-          <w:hyperlink w:anchor="_Toc243961204" w:history="1">
+          <w:hyperlink w:anchor="_Toc243962803" w:history="1">
             <w:r>
               <w:rPr>
                 <w:rStyle w:val="a5"/>
@@ -3508,7 +3508,7 @@
               <w:rPr>
                 <w:noProof/>
               </w:rPr>
-              <w:instrText xml:space="preserve"> PAGEREF _Toc243961204 \h </w:instrText>
+              <w:instrText xml:space="preserve"> PAGEREF _Toc243962803 \h </w:instrText>
             </w:r>
             <w:r>
               <w:rPr>
@@ -3551,7 +3551,7 @@
               <w14:ligatures w14:val="standardContextual"/>
             </w:rPr>
           </w:pPr>
-          <w:hyperlink w:anchor="_Toc243961205" w:history="1">
+          <w:hyperlink w:anchor="_Toc243962804" w:history="1">
             <w:r>
               <w:rPr>
                 <w:rStyle w:val="a5"/>
@@ -3596,7 +3596,7 @@
               <w:rPr>
                 <w:noProof/>
               </w:rPr>
-              <w:instrText xml:space="preserve"> PAGEREF _Toc243961205 \h </w:instrText>
+              <w:instrText xml:space="preserve"> PAGEREF _Toc243962804 \h </w:instrText>
             </w:r>
             <w:r>
               <w:rPr>
@@ -3639,7 +3639,7 @@
               <w14:ligatures w14:val="standardContextual"/>
             </w:rPr>
           </w:pPr>
-          <w:hyperlink w:anchor="_Toc243961206" w:history="1">
+          <w:hyperlink w:anchor="_Toc243962805" w:history="1">
             <w:r>
               <w:rPr>
                 <w:rStyle w:val="a5"/>
@@ -3670,7 +3670,7 @@
               <w:rPr>
                 <w:noProof/>
               </w:rPr>
-              <w:instrText xml:space="preserve"> PAGEREF _Toc243961206 \h </w:instrText>
+              <w:instrText xml:space="preserve"> PAGEREF _Toc243962805 \h </w:instrText>
             </w:r>
             <w:r>
               <w:rPr>
@@ -3715,7 +3715,7 @@
               <w14:ligatures w14:val="standardContextual"/>
             </w:rPr>
           </w:pPr>
-          <w:hyperlink w:anchor="_Toc243961207" w:history="1">
+          <w:hyperlink w:anchor="_Toc243962806" w:history="1">
             <w:r>
               <w:rPr>
                 <w:rStyle w:val="a5"/>
@@ -3767,7 +3767,7 @@
               <w:rPr>
                 <w:noProof/>
               </w:rPr>
-              <w:instrText xml:space="preserve"> PAGEREF _Toc243961207 \h </w:instrText>
+              <w:instrText xml:space="preserve"> PAGEREF _Toc243962806 \h </w:instrText>
             </w:r>
             <w:r>
               <w:rPr>
@@ -3810,7 +3810,7 @@
               <w14:ligatures w14:val="standardContextual"/>
             </w:rPr>
           </w:pPr>
-          <w:hyperlink w:anchor="_Toc243961208" w:history="1">
+          <w:hyperlink w:anchor="_Toc243962807" w:history="1">
             <w:r>
               <w:rPr>
                 <w:rStyle w:val="a5"/>
@@ -3841,7 +3841,7 @@
               <w:rPr>
                 <w:noProof/>
               </w:rPr>
-              <w:instrText xml:space="preserve"> PAGEREF _Toc243961208 \h </w:instrText>
+              <w:instrText xml:space="preserve"> PAGEREF _Toc243962807 \h </w:instrText>
             </w:r>
             <w:r>
               <w:rPr>
@@ -3884,7 +3884,7 @@
               <w14:ligatures w14:val="standardContextual"/>
             </w:rPr>
           </w:pPr>
-          <w:hyperlink w:anchor="_Toc243961209" w:history="1">
+          <w:hyperlink w:anchor="_Toc243962808" w:history="1">
             <w:r>
               <w:rPr>
                 <w:rStyle w:val="a5"/>
@@ -3915,7 +3915,7 @@
               <w:rPr>
                 <w:noProof/>
               </w:rPr>
-              <w:instrText xml:space="preserve"> PAGEREF _Toc243961209 \h </w:instrText>
+              <w:instrText xml:space="preserve"> PAGEREF _Toc243962808 \h </w:instrText>
             </w:r>
             <w:r>
               <w:rPr>
@@ -3958,7 +3958,7 @@
               <w14:ligatures w14:val="standardContextual"/>
             </w:rPr>
           </w:pPr>
-          <w:hyperlink w:anchor="_Toc243961210" w:history="1">
+          <w:hyperlink w:anchor="_Toc243962809" w:history="1">
             <w:r>
               <w:rPr>
                 <w:rStyle w:val="a5"/>
@@ -3989,7 +3989,7 @@
               <w:rPr>
                 <w:noProof/>
               </w:rPr>
-              <w:instrText xml:space="preserve"> PAGEREF _Toc243961210 \h </w:instrText>
+              <w:instrText xml:space="preserve"> PAGEREF _Toc243962809 \h </w:instrText>
             </w:r>
             <w:r>
               <w:rPr>
@@ -4034,7 +4034,7 @@
               <w14:ligatures w14:val="standardContextual"/>
             </w:rPr>
           </w:pPr>
-          <w:hyperlink w:anchor="_Toc243961211" w:history="1">
+          <w:hyperlink w:anchor="_Toc243962810" w:history="1">
             <w:r>
               <w:rPr>
                 <w:rStyle w:val="a5"/>
@@ -4072,7 +4072,7 @@
               <w:rPr>
                 <w:noProof/>
               </w:rPr>
-              <w:instrText xml:space="preserve"> PAGEREF _Toc243961211 \h </w:instrText>
+              <w:instrText xml:space="preserve"> PAGEREF _Toc243962810 \h </w:instrText>
             </w:r>
             <w:r>
               <w:rPr>
@@ -4117,7 +4117,7 @@
               <w14:ligatures w14:val="standardContextual"/>
             </w:rPr>
           </w:pPr>
-          <w:hyperlink w:anchor="_Toc243961212" w:history="1">
+          <w:hyperlink w:anchor="_Toc243962811" w:history="1">
             <w:r>
               <w:rPr>
                 <w:rStyle w:val="a5"/>
@@ -4155,7 +4155,7 @@
               <w:rPr>
                 <w:noProof/>
               </w:rPr>
-              <w:instrText xml:space="preserve"> PAGEREF _Toc243961212 \h </w:instrText>
+              <w:instrText xml:space="preserve"> PAGEREF _Toc243962811 \h </w:instrText>
             </w:r>
             <w:r>
               <w:rPr>
@@ -4194,7 +4194,7 @@
         <w:pStyle w:val="1"/>
         <w:pageBreakBefore/>
       </w:pPr>
-      <w:bookmarkStart w:id="0" w:name="_Toc243961168"/>
+      <w:bookmarkStart w:id="0" w:name="_Toc243962767"/>
       <w:r>
         <w:lastRenderedPageBreak/>
         <w:t>第</w:t>
@@ -4275,7 +4275,7 @@
           <w:noProof/>
         </w:rPr>
         <w:drawing>
-          <wp:inline distT="0" distB="0" distL="0" distR="0" wp14:anchorId="0EE29932" wp14:editId="261BCB70">
+          <wp:inline distT="0" distB="0" distL="0" distR="0" wp14:anchorId="47B2955B" wp14:editId="2918AC5C">
             <wp:extent cx="5715000" cy="3219450"/>
             <wp:effectExtent l="0" t="0" r="0" b="0"/>
             <wp:docPr id="1" name="兩日活動功能地圖" descr="兩日活動功能地圖" title="兩日活動功能地圖"/>
@@ -4318,7 +4318,7 @@
       <w:pPr>
         <w:pStyle w:val="2"/>
       </w:pPr>
-      <w:bookmarkStart w:id="1" w:name="_Toc243961169"/>
+      <w:bookmarkStart w:id="1" w:name="_Toc243962768"/>
       <w:r>
         <w:t xml:space="preserve">1.1 </w:t>
       </w:r>
@@ -5578,7 +5578,7 @@
       <w:pPr>
         <w:pStyle w:val="2"/>
       </w:pPr>
-      <w:bookmarkStart w:id="2" w:name="_Toc243961170"/>
+      <w:bookmarkStart w:id="2" w:name="_Toc243962769"/>
       <w:r>
         <w:lastRenderedPageBreak/>
         <w:t xml:space="preserve">1.2 </w:t>
@@ -5702,7 +5702,7 @@
         <w:pStyle w:val="1"/>
         <w:pageBreakBefore/>
       </w:pPr>
-      <w:bookmarkStart w:id="3" w:name="_Toc243961171"/>
+      <w:bookmarkStart w:id="3" w:name="_Toc243962770"/>
       <w:r>
         <w:lastRenderedPageBreak/>
         <w:t>第</w:t>
@@ -5719,7 +5719,7 @@
       <w:pPr>
         <w:pStyle w:val="2"/>
       </w:pPr>
-      <w:bookmarkStart w:id="4" w:name="_Toc243961172"/>
+      <w:bookmarkStart w:id="4" w:name="_Toc243962771"/>
       <w:r>
         <w:t xml:space="preserve">2.1 </w:t>
       </w:r>
@@ -6234,10 +6234,10 @@
           <w:noProof/>
         </w:rPr>
         <w:drawing>
-          <wp:inline distT="0" distB="0" distL="0" distR="0" wp14:anchorId="1358567A" wp14:editId="3EFA4CCA">
+          <wp:inline distT="0" distB="0" distL="0" distR="0" wp14:anchorId="32991945" wp14:editId="366B295C">
             <wp:extent cx="5715000" cy="3219450"/>
             <wp:effectExtent l="0" t="0" r="0" b="0"/>
-            <wp:docPr id="1955167168" name="代理程式架構圖" descr="代理程式架構圖" title="代理程式架構圖"/>
+            <wp:docPr id="1673027674" name="代理程式架構圖" descr="代理程式架構圖" title="代理程式架構圖"/>
             <wp:cNvGraphicFramePr>
               <a:graphicFrameLocks xmlns:a="http://schemas.openxmlformats.org/drawingml/2006/main" noChangeAspect="1"/>
             </wp:cNvGraphicFramePr>
@@ -6277,7 +6277,7 @@
       <w:pPr>
         <w:pStyle w:val="2"/>
       </w:pPr>
-      <w:bookmarkStart w:id="5" w:name="_Toc243961173"/>
+      <w:bookmarkStart w:id="5" w:name="_Toc243962772"/>
       <w:r>
         <w:lastRenderedPageBreak/>
         <w:t xml:space="preserve">2.2 </w:t>
@@ -6961,7 +6961,7 @@
       <w:pPr>
         <w:pStyle w:val="2"/>
       </w:pPr>
-      <w:bookmarkStart w:id="6" w:name="_Toc243961174"/>
+      <w:bookmarkStart w:id="6" w:name="_Toc243962773"/>
       <w:r>
         <w:t xml:space="preserve">2.3 </w:t>
       </w:r>
@@ -9338,7 +9338,7 @@
       <w:pPr>
         <w:pStyle w:val="2"/>
       </w:pPr>
-      <w:bookmarkStart w:id="7" w:name="_Toc243961175"/>
+      <w:bookmarkStart w:id="7" w:name="_Toc243962774"/>
       <w:r>
         <w:lastRenderedPageBreak/>
         <w:t xml:space="preserve">2.4 </w:t>
@@ -9384,10 +9384,10 @@
           <w:noProof/>
         </w:rPr>
         <w:drawing>
-          <wp:inline distT="0" distB="0" distL="0" distR="0" wp14:anchorId="2360C800" wp14:editId="52E5654A">
+          <wp:inline distT="0" distB="0" distL="0" distR="0" wp14:anchorId="481E783A" wp14:editId="53F71FB0">
             <wp:extent cx="5715000" cy="3219450"/>
             <wp:effectExtent l="0" t="0" r="0" b="0"/>
-            <wp:docPr id="1726600573" name="建置流程圖" descr="建置流程圖" title="建置流程圖"/>
+            <wp:docPr id="1415563638" name="建置流程圖" descr="建置流程圖" title="建置流程圖"/>
             <wp:cNvGraphicFramePr>
               <a:graphicFrameLocks xmlns:a="http://schemas.openxmlformats.org/drawingml/2006/main" noChangeAspect="1"/>
             </wp:cNvGraphicFramePr>
@@ -9433,10 +9433,10 @@
           <w:noProof/>
         </w:rPr>
         <w:drawing>
-          <wp:inline distT="0" distB="0" distL="0" distR="0" wp14:anchorId="456BB80D" wp14:editId="5080A157">
+          <wp:inline distT="0" distB="0" distL="0" distR="0" wp14:anchorId="4A877BE1" wp14:editId="4AA83184">
             <wp:extent cx="5715000" cy="3219450"/>
             <wp:effectExtent l="0" t="0" r="0" b="0"/>
-            <wp:docPr id="1400506909" name="基礎版建置時間配置" descr="基礎版建置時間配置" title="基礎版建置時間配置"/>
+            <wp:docPr id="532628471" name="基礎版建置時間配置" descr="基礎版建置時間配置" title="基礎版建置時間配置"/>
             <wp:cNvGraphicFramePr>
               <a:graphicFrameLocks xmlns:a="http://schemas.openxmlformats.org/drawingml/2006/main" noChangeAspect="1"/>
             </wp:cNvGraphicFramePr>
@@ -9476,7 +9476,7 @@
       <w:pPr>
         <w:pStyle w:val="2"/>
       </w:pPr>
-      <w:bookmarkStart w:id="8" w:name="_Toc243961176"/>
+      <w:bookmarkStart w:id="8" w:name="_Toc243962775"/>
       <w:r>
         <w:t xml:space="preserve">2.5 </w:t>
       </w:r>
@@ -11707,7 +11707,7 @@
       <w:pPr>
         <w:pStyle w:val="2"/>
       </w:pPr>
-      <w:bookmarkStart w:id="9" w:name="_Toc243961177"/>
+      <w:bookmarkStart w:id="9" w:name="_Toc243962776"/>
       <w:r>
         <w:t xml:space="preserve">2.6 </w:t>
       </w:r>
@@ -11747,10 +11747,10 @@
         </w:rPr>
         <w:lastRenderedPageBreak/>
         <w:drawing>
-          <wp:inline distT="0" distB="0" distL="0" distR="0" wp14:anchorId="71BA5F8B" wp14:editId="15F048A4">
+          <wp:inline distT="0" distB="0" distL="0" distR="0" wp14:anchorId="3180796F" wp14:editId="28BF610E">
             <wp:extent cx="5715000" cy="3219450"/>
             <wp:effectExtent l="0" t="0" r="0" b="0"/>
-            <wp:docPr id="486701839" name="代理程式對話流程" descr="代理程式對話流程" title="代理程式對話流程"/>
+            <wp:docPr id="683296005" name="代理程式對話流程" descr="代理程式對話流程" title="代理程式對話流程"/>
             <wp:cNvGraphicFramePr>
               <a:graphicFrameLocks xmlns:a="http://schemas.openxmlformats.org/drawingml/2006/main" noChangeAspect="1"/>
             </wp:cNvGraphicFramePr>
@@ -11790,7 +11790,7 @@
       <w:pPr>
         <w:pStyle w:val="2"/>
       </w:pPr>
-      <w:bookmarkStart w:id="10" w:name="_Toc243961178"/>
+      <w:bookmarkStart w:id="10" w:name="_Toc243962777"/>
       <w:r>
         <w:t xml:space="preserve">2.7 </w:t>
       </w:r>
@@ -12991,7 +12991,7 @@
       <w:pPr>
         <w:pStyle w:val="2"/>
       </w:pPr>
-      <w:bookmarkStart w:id="11" w:name="_Toc243961179"/>
+      <w:bookmarkStart w:id="11" w:name="_Toc243962778"/>
       <w:r>
         <w:t xml:space="preserve">2.8 </w:t>
       </w:r>
@@ -14000,7 +14000,7 @@
       <w:pPr>
         <w:pStyle w:val="2"/>
       </w:pPr>
-      <w:bookmarkStart w:id="12" w:name="_Toc243961180"/>
+      <w:bookmarkStart w:id="12" w:name="_Toc243962779"/>
       <w:r>
         <w:t xml:space="preserve">2.9 3 </w:t>
       </w:r>
@@ -15032,7 +15032,7 @@
       <w:pPr>
         <w:pStyle w:val="2"/>
       </w:pPr>
-      <w:bookmarkStart w:id="13" w:name="_Toc243961181"/>
+      <w:bookmarkStart w:id="13" w:name="_Toc243962780"/>
       <w:r>
         <w:t xml:space="preserve">2.10 </w:t>
       </w:r>
@@ -15790,7 +15790,7 @@
         <w:pStyle w:val="1"/>
         <w:pageBreakBefore/>
       </w:pPr>
-      <w:bookmarkStart w:id="14" w:name="_Toc243961182"/>
+      <w:bookmarkStart w:id="14" w:name="_Toc243962781"/>
       <w:r>
         <w:lastRenderedPageBreak/>
         <w:t>第</w:t>
@@ -15807,7 +15807,7 @@
       <w:pPr>
         <w:pStyle w:val="2"/>
       </w:pPr>
-      <w:bookmarkStart w:id="15" w:name="_Toc243961183"/>
+      <w:bookmarkStart w:id="15" w:name="_Toc243962782"/>
       <w:r>
         <w:t xml:space="preserve">3.1 </w:t>
       </w:r>
@@ -15834,10 +15834,10 @@
           <w:noProof/>
         </w:rPr>
         <w:drawing>
-          <wp:inline distT="0" distB="0" distL="0" distR="0" wp14:anchorId="3E1F79D8" wp14:editId="58922B22">
+          <wp:inline distT="0" distB="0" distL="0" distR="0" wp14:anchorId="50FB25BC" wp14:editId="4DE37A5B">
             <wp:extent cx="5715000" cy="3219450"/>
             <wp:effectExtent l="0" t="0" r="0" b="0"/>
-            <wp:docPr id="171171523" name="裝置探索提問漏斗" descr="裝置探索提問漏斗" title="裝置探索提問漏斗"/>
+            <wp:docPr id="1893240685" name="裝置探索提問漏斗" descr="裝置探索提問漏斗" title="裝置探索提問漏斗"/>
             <wp:cNvGraphicFramePr>
               <a:graphicFrameLocks xmlns:a="http://schemas.openxmlformats.org/drawingml/2006/main" noChangeAspect="1"/>
             </wp:cNvGraphicFramePr>
@@ -15877,7 +15877,7 @@
       <w:pPr>
         <w:pStyle w:val="2"/>
       </w:pPr>
-      <w:bookmarkStart w:id="16" w:name="_Toc243961184"/>
+      <w:bookmarkStart w:id="16" w:name="_Toc243962783"/>
       <w:r>
         <w:t xml:space="preserve">3.2 </w:t>
       </w:r>
@@ -16108,7 +16108,7 @@
       <w:pPr>
         <w:pStyle w:val="2"/>
       </w:pPr>
-      <w:bookmarkStart w:id="17" w:name="_Toc243961185"/>
+      <w:bookmarkStart w:id="17" w:name="_Toc243962784"/>
       <w:r>
         <w:lastRenderedPageBreak/>
         <w:t xml:space="preserve">3.3 </w:t>
@@ -17053,7 +17053,7 @@
       <w:pPr>
         <w:pStyle w:val="2"/>
       </w:pPr>
-      <w:bookmarkStart w:id="18" w:name="_Toc243961186"/>
+      <w:bookmarkStart w:id="18" w:name="_Toc243962785"/>
       <w:r>
         <w:t xml:space="preserve">3.4 </w:t>
       </w:r>
@@ -18612,7 +18612,7 @@
       <w:pPr>
         <w:pStyle w:val="2"/>
       </w:pPr>
-      <w:bookmarkStart w:id="19" w:name="_Toc243961187"/>
+      <w:bookmarkStart w:id="19" w:name="_Toc243962786"/>
       <w:r>
         <w:t xml:space="preserve">3.5 </w:t>
       </w:r>
@@ -19332,7 +19332,7 @@
       <w:pPr>
         <w:pStyle w:val="2"/>
       </w:pPr>
-      <w:bookmarkStart w:id="20" w:name="_Toc243961188"/>
+      <w:bookmarkStart w:id="20" w:name="_Toc243962787"/>
       <w:r>
         <w:t xml:space="preserve">3.6 </w:t>
       </w:r>
@@ -20629,7 +20629,7 @@
         <w:pStyle w:val="1"/>
         <w:pageBreakBefore/>
       </w:pPr>
-      <w:bookmarkStart w:id="21" w:name="_Toc243961189"/>
+      <w:bookmarkStart w:id="21" w:name="_Toc243962788"/>
       <w:r>
         <w:lastRenderedPageBreak/>
         <w:t>第</w:t>
@@ -20652,7 +20652,7 @@
       <w:pPr>
         <w:pStyle w:val="2"/>
       </w:pPr>
-      <w:bookmarkStart w:id="22" w:name="_Toc243961190"/>
+      <w:bookmarkStart w:id="22" w:name="_Toc243962789"/>
       <w:r>
         <w:t xml:space="preserve">4.1 </w:t>
       </w:r>
@@ -21701,7 +21701,7 @@
       <w:pPr>
         <w:pStyle w:val="2"/>
       </w:pPr>
-      <w:bookmarkStart w:id="23" w:name="_Toc243961191"/>
+      <w:bookmarkStart w:id="23" w:name="_Toc243962790"/>
       <w:r>
         <w:lastRenderedPageBreak/>
         <w:t xml:space="preserve">4.2 </w:t>
@@ -21721,10 +21721,10 @@
           <w:noProof/>
         </w:rPr>
         <w:drawing>
-          <wp:inline distT="0" distB="0" distL="0" distR="0" wp14:anchorId="7A8DA51E" wp14:editId="27047413">
+          <wp:inline distT="0" distB="0" distL="0" distR="0" wp14:anchorId="2AD9E5D4" wp14:editId="0452B7A8">
             <wp:extent cx="5715000" cy="3219450"/>
             <wp:effectExtent l="0" t="0" r="0" b="0"/>
-            <wp:docPr id="1205301877" name="Windows 11 加 Intel 解決方案架構" descr="Windows 11 加 Intel 解決方案架構" title="Windows 11 加 Intel 解決方案架構"/>
+            <wp:docPr id="361623466" name="Windows 11 加 Intel 解決方案架構" descr="Windows 11 加 Intel 解決方案架構" title="Windows 11 加 Intel 解決方案架構"/>
             <wp:cNvGraphicFramePr>
               <a:graphicFrameLocks xmlns:a="http://schemas.openxmlformats.org/drawingml/2006/main" noChangeAspect="1"/>
             </wp:cNvGraphicFramePr>
@@ -22258,7 +22258,7 @@
       <w:pPr>
         <w:pStyle w:val="2"/>
       </w:pPr>
-      <w:bookmarkStart w:id="24" w:name="_Toc243961192"/>
+      <w:bookmarkStart w:id="24" w:name="_Toc243962791"/>
       <w:r>
         <w:lastRenderedPageBreak/>
         <w:t xml:space="preserve">4.3 10 </w:t>
@@ -22284,10 +22284,10 @@
           <w:noProof/>
         </w:rPr>
         <w:drawing>
-          <wp:inline distT="0" distB="0" distL="0" distR="0" wp14:anchorId="70E5C043" wp14:editId="390DAF7E">
+          <wp:inline distT="0" distB="0" distL="0" distR="0" wp14:anchorId="745C6000" wp14:editId="16DBD424">
             <wp:extent cx="5715000" cy="3219450"/>
             <wp:effectExtent l="0" t="0" r="0" b="0"/>
-            <wp:docPr id="775351934" name="Demo 流程" descr="Demo 流程" title="Demo 流程"/>
+            <wp:docPr id="831340718" name="Demo 流程" descr="Demo 流程" title="Demo 流程"/>
             <wp:cNvGraphicFramePr>
               <a:graphicFrameLocks xmlns:a="http://schemas.openxmlformats.org/drawingml/2006/main" noChangeAspect="1"/>
             </wp:cNvGraphicFramePr>
@@ -23591,10 +23591,10 @@
         </w:rPr>
         <w:lastRenderedPageBreak/>
         <w:drawing>
-          <wp:inline distT="0" distB="0" distL="0" distR="0" wp14:anchorId="5D125701" wp14:editId="23A0A039">
+          <wp:inline distT="0" distB="0" distL="0" distR="0" wp14:anchorId="0A66318A" wp14:editId="0D87210D">
             <wp:extent cx="5715000" cy="3219450"/>
             <wp:effectExtent l="0" t="0" r="0" b="0"/>
-            <wp:docPr id="1860717607" name="Demo 各段時間配置" descr="Demo 各段時間配置" title="Demo 各段時間配置"/>
+            <wp:docPr id="727695263" name="Demo 各段時間配置" descr="Demo 各段時間配置" title="Demo 各段時間配置"/>
             <wp:cNvGraphicFramePr>
               <a:graphicFrameLocks xmlns:a="http://schemas.openxmlformats.org/drawingml/2006/main" noChangeAspect="1"/>
             </wp:cNvGraphicFramePr>
@@ -23634,7 +23634,7 @@
       <w:pPr>
         <w:pStyle w:val="2"/>
       </w:pPr>
-      <w:bookmarkStart w:id="25" w:name="_Toc243961193"/>
+      <w:bookmarkStart w:id="25" w:name="_Toc243962792"/>
       <w:r>
         <w:t xml:space="preserve">4.4 </w:t>
       </w:r>
@@ -24523,7 +24523,7 @@
       <w:pPr>
         <w:pStyle w:val="2"/>
       </w:pPr>
-      <w:bookmarkStart w:id="26" w:name="_Toc243961194"/>
+      <w:bookmarkStart w:id="26" w:name="_Toc243962793"/>
       <w:r>
         <w:lastRenderedPageBreak/>
         <w:t xml:space="preserve">4.5 </w:t>
@@ -24543,10 +24543,10 @@
           <w:noProof/>
         </w:rPr>
         <w:drawing>
-          <wp:inline distT="0" distB="0" distL="0" distR="0" wp14:anchorId="642F82E5" wp14:editId="0DBD8361">
+          <wp:inline distT="0" distB="0" distL="0" distR="0" wp14:anchorId="140B9FC1" wp14:editId="1CFC7327">
             <wp:extent cx="5715000" cy="3219450"/>
             <wp:effectExtent l="0" t="0" r="0" b="0"/>
-            <wp:docPr id="413504064" name="依職務配置對平均單價的影響" descr="依職務配置對平均單價的影響" title="依職務配置對平均單價的影響"/>
+            <wp:docPr id="1676947692" name="依職務配置對平均單價的影響" descr="依職務配置對平均單價的影響" title="依職務配置對平均單價的影響"/>
             <wp:cNvGraphicFramePr>
               <a:graphicFrameLocks xmlns:a="http://schemas.openxmlformats.org/drawingml/2006/main" noChangeAspect="1"/>
             </wp:cNvGraphicFramePr>
@@ -24734,7 +24734,7 @@
       <w:pPr>
         <w:pStyle w:val="2"/>
       </w:pPr>
-      <w:bookmarkStart w:id="27" w:name="_Toc243961195"/>
+      <w:bookmarkStart w:id="27" w:name="_Toc243962794"/>
       <w:r>
         <w:t xml:space="preserve">4.6 </w:t>
       </w:r>
@@ -25631,7 +25631,7 @@
         <w:pStyle w:val="1"/>
         <w:pageBreakBefore/>
       </w:pPr>
-      <w:bookmarkStart w:id="28" w:name="_Toc243961196"/>
+      <w:bookmarkStart w:id="28" w:name="_Toc243962795"/>
       <w:r>
         <w:lastRenderedPageBreak/>
         <w:t>第</w:t>
@@ -25654,7 +25654,7 @@
       <w:pPr>
         <w:pStyle w:val="2"/>
       </w:pPr>
-      <w:bookmarkStart w:id="29" w:name="_Toc243961197"/>
+      <w:bookmarkStart w:id="29" w:name="_Toc243962796"/>
       <w:r>
         <w:t xml:space="preserve">5.1 </w:t>
       </w:r>
@@ -25693,10 +25693,10 @@
           <w:noProof/>
         </w:rPr>
         <w:drawing>
-          <wp:inline distT="0" distB="0" distL="0" distR="0" wp14:anchorId="3A65E134" wp14:editId="717D4DDF">
+          <wp:inline distT="0" distB="0" distL="0" distR="0" wp14:anchorId="1BDA4FF3" wp14:editId="2139DA45">
             <wp:extent cx="5715000" cy="3219450"/>
             <wp:effectExtent l="0" t="0" r="0" b="0"/>
-            <wp:docPr id="1830770458" name="90 天作戰計畫六個步驟" descr="90 天作戰計畫六個步驟" title="90 天作戰計畫六個步驟"/>
+            <wp:docPr id="434506383" name="90 天作戰計畫六個步驟" descr="90 天作戰計畫六個步驟" title="90 天作戰計畫六個步驟"/>
             <wp:cNvGraphicFramePr>
               <a:graphicFrameLocks xmlns:a="http://schemas.openxmlformats.org/drawingml/2006/main" noChangeAspect="1"/>
             </wp:cNvGraphicFramePr>
@@ -26099,7 +26099,7 @@
       <w:pPr>
         <w:pStyle w:val="2"/>
       </w:pPr>
-      <w:bookmarkStart w:id="30" w:name="_Toc243961198"/>
+      <w:bookmarkStart w:id="30" w:name="_Toc243962797"/>
       <w:r>
         <w:lastRenderedPageBreak/>
         <w:t xml:space="preserve">5.2 90 </w:t>
@@ -26119,10 +26119,10 @@
           <w:noProof/>
         </w:rPr>
         <w:drawing>
-          <wp:inline distT="0" distB="0" distL="0" distR="0" wp14:anchorId="6F2156E0" wp14:editId="6D0EBABF">
+          <wp:inline distT="0" distB="0" distL="0" distR="0" wp14:anchorId="43775D5C" wp14:editId="55457986">
             <wp:extent cx="5715000" cy="3219450"/>
             <wp:effectExtent l="0" t="0" r="0" b="0"/>
-            <wp:docPr id="1423741635" name="90 天時程" descr="90 天時程" title="90 天時程"/>
+            <wp:docPr id="1632835357" name="90 天時程" descr="90 天時程" title="90 天時程"/>
             <wp:cNvGraphicFramePr>
               <a:graphicFrameLocks xmlns:a="http://schemas.openxmlformats.org/drawingml/2006/main" noChangeAspect="1"/>
             </wp:cNvGraphicFramePr>
@@ -26162,7 +26162,7 @@
       <w:pPr>
         <w:pStyle w:val="2"/>
       </w:pPr>
-      <w:bookmarkStart w:id="31" w:name="_Toc243961199"/>
+      <w:bookmarkStart w:id="31" w:name="_Toc243962798"/>
       <w:r>
         <w:t xml:space="preserve">5.3 KPI </w:t>
       </w:r>
@@ -26181,10 +26181,10 @@
           <w:noProof/>
         </w:rPr>
         <w:drawing>
-          <wp:inline distT="0" distB="0" distL="0" distR="0" wp14:anchorId="691F1676" wp14:editId="68ADAE6B">
+          <wp:inline distT="0" distB="0" distL="0" distR="0" wp14:anchorId="6553E11E" wp14:editId="5DF03B20">
             <wp:extent cx="5715000" cy="3219450"/>
             <wp:effectExtent l="0" t="0" r="0" b="0"/>
-            <wp:docPr id="429036906" name="KPI 漏斗" descr="KPI 漏斗" title="KPI 漏斗"/>
+            <wp:docPr id="1399468751" name="KPI 漏斗" descr="KPI 漏斗" title="KPI 漏斗"/>
             <wp:cNvGraphicFramePr>
               <a:graphicFrameLocks xmlns:a="http://schemas.openxmlformats.org/drawingml/2006/main" noChangeAspect="1"/>
             </wp:cNvGraphicFramePr>
@@ -26969,7 +26969,7 @@
       <w:pPr>
         <w:pStyle w:val="2"/>
       </w:pPr>
-      <w:bookmarkStart w:id="32" w:name="_Toc243961200"/>
+      <w:bookmarkStart w:id="32" w:name="_Toc243962799"/>
       <w:r>
         <w:t xml:space="preserve">5.4 </w:t>
       </w:r>
@@ -27616,7 +27616,7 @@
       <w:pPr>
         <w:pStyle w:val="2"/>
       </w:pPr>
-      <w:bookmarkStart w:id="33" w:name="_Toc243961201"/>
+      <w:bookmarkStart w:id="33" w:name="_Toc243962800"/>
       <w:r>
         <w:t xml:space="preserve">5.5 3 </w:t>
       </w:r>
@@ -28552,7 +28552,7 @@
         <w:pStyle w:val="1"/>
         <w:pageBreakBefore/>
       </w:pPr>
-      <w:bookmarkStart w:id="34" w:name="_Toc243961202"/>
+      <w:bookmarkStart w:id="34" w:name="_Toc243962801"/>
       <w:r>
         <w:lastRenderedPageBreak/>
         <w:t>第</w:t>
@@ -28581,7 +28581,7 @@
       <w:pPr>
         <w:pStyle w:val="2"/>
       </w:pPr>
-      <w:bookmarkStart w:id="35" w:name="_Toc243961203"/>
+      <w:bookmarkStart w:id="35" w:name="_Toc243962802"/>
       <w:r>
         <w:t xml:space="preserve">6.1 </w:t>
       </w:r>
@@ -29176,7 +29176,7 @@
       <w:pPr>
         <w:pStyle w:val="2"/>
       </w:pPr>
-      <w:bookmarkStart w:id="36" w:name="_Toc243961204"/>
+      <w:bookmarkStart w:id="36" w:name="_Toc243962803"/>
       <w:r>
         <w:t xml:space="preserve">6.2 </w:t>
       </w:r>
@@ -29195,10 +29195,10 @@
           <w:noProof/>
         </w:rPr>
         <w:drawing>
-          <wp:inline distT="0" distB="0" distL="0" distR="0" wp14:anchorId="6A091AE1" wp14:editId="7A592C09">
+          <wp:inline distT="0" distB="0" distL="0" distR="0" wp14:anchorId="641924CC" wp14:editId="33A58EB6">
             <wp:extent cx="5715000" cy="3219450"/>
             <wp:effectExtent l="0" t="0" r="0" b="0"/>
-            <wp:docPr id="813624017" name="Envisioning 60 分鐘工作坊流程" descr="Envisioning 60 分鐘工作坊流程" title="Envisioning 60 分鐘工作坊流程"/>
+            <wp:docPr id="263364642" name="Envisioning 60 分鐘工作坊流程" descr="Envisioning 60 分鐘工作坊流程" title="Envisioning 60 分鐘工作坊流程"/>
             <wp:cNvGraphicFramePr>
               <a:graphicFrameLocks xmlns:a="http://schemas.openxmlformats.org/drawingml/2006/main" noChangeAspect="1"/>
             </wp:cNvGraphicFramePr>
@@ -29630,7 +29630,7 @@
       <w:pPr>
         <w:pStyle w:val="2"/>
       </w:pPr>
-      <w:bookmarkStart w:id="37" w:name="_Toc243961205"/>
+      <w:bookmarkStart w:id="37" w:name="_Toc243962804"/>
       <w:r>
         <w:t xml:space="preserve">6.3 </w:t>
       </w:r>
@@ -29655,10 +29655,10 @@
           <w:noProof/>
         </w:rPr>
         <w:drawing>
-          <wp:inline distT="0" distB="0" distL="0" distR="0" wp14:anchorId="49FB509A" wp14:editId="494FFD2F">
+          <wp:inline distT="0" distB="0" distL="0" distR="0" wp14:anchorId="7160A578" wp14:editId="23B8E621">
             <wp:extent cx="5715000" cy="3219450"/>
             <wp:effectExtent l="0" t="0" r="0" b="0"/>
-            <wp:docPr id="378789668" name="價值與難度矩陣" descr="價值與難度矩陣" title="價值與難度矩陣"/>
+            <wp:docPr id="835568301" name="價值與難度矩陣" descr="價值與難度矩陣" title="價值與難度矩陣"/>
             <wp:cNvGraphicFramePr>
               <a:graphicFrameLocks xmlns:a="http://schemas.openxmlformats.org/drawingml/2006/main" noChangeAspect="1"/>
             </wp:cNvGraphicFramePr>
@@ -29698,7 +29698,7 @@
       <w:pPr>
         <w:pStyle w:val="2"/>
       </w:pPr>
-      <w:bookmarkStart w:id="38" w:name="_Toc243961206"/>
+      <w:bookmarkStart w:id="38" w:name="_Toc243962805"/>
       <w:r>
         <w:t xml:space="preserve">6.4 </w:t>
       </w:r>
@@ -30552,7 +30552,7 @@
         <w:pStyle w:val="1"/>
         <w:pageBreakBefore/>
       </w:pPr>
-      <w:bookmarkStart w:id="39" w:name="_Toc243961207"/>
+      <w:bookmarkStart w:id="39" w:name="_Toc243962806"/>
       <w:r>
         <w:lastRenderedPageBreak/>
         <w:t>第</w:t>
@@ -30575,7 +30575,7 @@
       <w:pPr>
         <w:pStyle w:val="2"/>
       </w:pPr>
-      <w:bookmarkStart w:id="40" w:name="_Toc243961208"/>
+      <w:bookmarkStart w:id="40" w:name="_Toc243962807"/>
       <w:r>
         <w:t xml:space="preserve">7.1 </w:t>
       </w:r>
@@ -30777,7 +30777,7 @@
       <w:pPr>
         <w:pStyle w:val="2"/>
       </w:pPr>
-      <w:bookmarkStart w:id="41" w:name="_Toc243961209"/>
+      <w:bookmarkStart w:id="41" w:name="_Toc243962808"/>
       <w:r>
         <w:t xml:space="preserve">7.2 </w:t>
       </w:r>
@@ -30796,10 +30796,10 @@
           <w:noProof/>
         </w:rPr>
         <w:drawing>
-          <wp:inline distT="0" distB="0" distL="0" distR="0" wp14:anchorId="1CB0DABA" wp14:editId="47C3E591">
+          <wp:inline distT="0" distB="0" distL="0" distR="0" wp14:anchorId="07614B72" wp14:editId="3A980485">
             <wp:extent cx="5715000" cy="3219450"/>
             <wp:effectExtent l="0" t="0" r="0" b="0"/>
-            <wp:docPr id="229757989" name="實機操作功能地圖" descr="實機操作功能地圖" title="實機操作功能地圖"/>
+            <wp:docPr id="690150150" name="實機操作功能地圖" descr="實機操作功能地圖" title="實機操作功能地圖"/>
             <wp:cNvGraphicFramePr>
               <a:graphicFrameLocks xmlns:a="http://schemas.openxmlformats.org/drawingml/2006/main" noChangeAspect="1"/>
             </wp:cNvGraphicFramePr>
@@ -30839,7 +30839,7 @@
       <w:pPr>
         <w:pStyle w:val="2"/>
       </w:pPr>
-      <w:bookmarkStart w:id="42" w:name="_Toc243961210"/>
+      <w:bookmarkStart w:id="42" w:name="_Toc243962809"/>
       <w:r>
         <w:t xml:space="preserve">7.3 12 </w:t>
       </w:r>
@@ -32976,7 +32976,7 @@
         <w:pStyle w:val="1"/>
         <w:pageBreakBefore/>
       </w:pPr>
-      <w:bookmarkStart w:id="43" w:name="_Toc243961211"/>
+      <w:bookmarkStart w:id="43" w:name="_Toc243962810"/>
       <w:r>
         <w:lastRenderedPageBreak/>
         <w:t>附錄</w:t>
@@ -34354,7 +34354,7 @@
         <w:pStyle w:val="1"/>
         <w:pageBreakBefore/>
       </w:pPr>
-      <w:bookmarkStart w:id="44" w:name="_Toc243961212"/>
+      <w:bookmarkStart w:id="44" w:name="_Toc243962811"/>
       <w:r>
         <w:lastRenderedPageBreak/>
         <w:t>附錄</w:t>
@@ -35293,10 +35293,10 @@
 <file path=word/numbering.xml><?xml version="1.0" encoding="utf-8"?>
 <w:numbering xmlns:wpc="http://schemas.microsoft.com/office/word/2010/wordprocessingCanvas" xmlns:cx="http://schemas.microsoft.com/office/drawing/2014/chartex" xmlns:cx1="http://schemas.microsoft.com/office/drawing/2015/9/8/chartex" xmlns:cx2="http://schemas.microsoft.com/office/drawing/2015/10/21/chartex" xmlns:cx3="http://schemas.microsoft.com/office/drawing/2016/5/9/chartex" xmlns:cx4="http://schemas.microsoft.com/office/drawing/2016/5/10/chartex" xmlns:cx5="http://schemas.microsoft.com/office/drawing/2016/5/11/chartex" xmlns:cx6="http://schemas.microsoft.com/office/drawing/2016/5/12/chartex" xmlns:cx7="http://schemas.microsoft.com/office/drawing/2016/5/13/chartex" xmlns:cx8="http://schemas.microsoft.com/office/drawing/2016/5/14/chartex" xmlns:mc="http://schemas.openxmlformats.org/markup-compatibility/2006" xmlns:aink="http://schemas.microsoft.com/office/drawing/2016/ink" xmlns:am3d="http://schemas.microsoft.com/office/drawing/2017/model3d" xmlns:o="urn:schemas-microsoft-com:office:office" xmlns:oel="http://schemas.microsoft.com/office/2019/extlst" xmlns:r="http://schemas.openxmlformats.org/officeDocument/2006/relationships" xmlns:m="http://schemas.openxmlformats.org/officeDocument/2006/math" xmlns:v="urn:schemas-microsoft-com:vml" xmlns:wp14="http://schemas.microsoft.com/office/word/2010/wordprocessingDrawing" xmlns:wp="http://schemas.openxmlformats.org/drawingml/2006/wordprocessingDrawing" xmlns:w10="urn:schemas-microsoft-com:office:word" xmlns:w="http://schemas.openxmlformats.org/wordprocessingml/2006/main" xmlns:w14="http://schemas.microsoft.com/office/word/2010/wordml" xmlns:w15="http://schemas.microsoft.com/office/word/2012/wordml" xmlns:w16cex="http://schemas.microsoft.com/office/word/2018/wordml/cex" xmlns:w16cid="http://schemas.microsoft.com/office/word/2016/wordml/cid" xmlns:w16="http://schemas.microsoft.com/office/word/2018/wordml" xmlns:w16du="http://schemas.microsoft.com/office/word/2023/wordml/word16du" xmlns:w16sdtdh="http://schemas.microsoft.com/office/word/2020/wordml/sdtdatahash" xmlns:w16sdtfl="http://schemas.microsoft.com/office/word/2024/wordml/sdtformatlock" xmlns:w16se="http://schemas.microsoft.com/office/word/2015/wordml/symex" xmlns:wpg="http://schemas.microsoft.com/office/word/2010/wordprocessingGroup" xmlns:wpi="http://schemas.microsoft.com/office/word/2010/wordprocessingInk" xmlns:wne="http://schemas.microsoft.com/office/word/2006/wordml" xmlns:wps="http://schemas.microsoft.com/office/word/2010/wordprocessingShape" mc:Ignorable="w14 w15 w16se w16cid w16 w16cex w16sdtdh w16sdtfl w16du wp14">
   <w:abstractNum w:abstractNumId="0" w15:restartNumberingAfterBreak="0">
-    <w:nsid w:val="087C3D9B"/>
+    <w:nsid w:val="2A537A8A"/>
     <w:multiLevelType w:val="hybridMultilevel"/>
-    <w:tmpl w:val="454CE22E"/>
-    <w:lvl w:ilvl="0" w:tplc="94343068">
+    <w:tmpl w:val="9A4AB8D4"/>
+    <w:lvl w:ilvl="0" w:tplc="5116349C">
       <w:start w:val="1"/>
       <w:numFmt w:val="decimal"/>
       <w:lvlText w:val="步驟 %1."/>
@@ -35310,52 +35310,138 @@
         <w:color w:val="0A5BD3"/>
       </w:rPr>
     </w:lvl>
-    <w:lvl w:ilvl="1" w:tplc="82661E30">
+    <w:lvl w:ilvl="1" w:tplc="9F40FAAA">
       <w:numFmt w:val="decimal"/>
       <w:lvlText w:val=""/>
       <w:lvlJc w:val="left"/>
     </w:lvl>
-    <w:lvl w:ilvl="2" w:tplc="579EA9D0">
+    <w:lvl w:ilvl="2" w:tplc="024A3746">
       <w:numFmt w:val="decimal"/>
       <w:lvlText w:val=""/>
       <w:lvlJc w:val="left"/>
     </w:lvl>
-    <w:lvl w:ilvl="3" w:tplc="382A0A94">
+    <w:lvl w:ilvl="3" w:tplc="E92E061E">
       <w:numFmt w:val="decimal"/>
       <w:lvlText w:val=""/>
       <w:lvlJc w:val="left"/>
     </w:lvl>
-    <w:lvl w:ilvl="4" w:tplc="224E6328">
+    <w:lvl w:ilvl="4" w:tplc="1534BA1E">
       <w:numFmt w:val="decimal"/>
       <w:lvlText w:val=""/>
       <w:lvlJc w:val="left"/>
     </w:lvl>
-    <w:lvl w:ilvl="5" w:tplc="7EC614EA">
+    <w:lvl w:ilvl="5" w:tplc="BFC21DB2">
       <w:numFmt w:val="decimal"/>
       <w:lvlText w:val=""/>
       <w:lvlJc w:val="left"/>
     </w:lvl>
-    <w:lvl w:ilvl="6" w:tplc="C45C76E4">
+    <w:lvl w:ilvl="6" w:tplc="C046B498">
       <w:numFmt w:val="decimal"/>
       <w:lvlText w:val=""/>
       <w:lvlJc w:val="left"/>
     </w:lvl>
-    <w:lvl w:ilvl="7" w:tplc="A8B00F48">
+    <w:lvl w:ilvl="7" w:tplc="CF3CDDE6">
       <w:numFmt w:val="decimal"/>
       <w:lvlText w:val=""/>
       <w:lvlJc w:val="left"/>
     </w:lvl>
-    <w:lvl w:ilvl="8" w:tplc="91502406">
+    <w:lvl w:ilvl="8" w:tplc="45E25C6E">
       <w:numFmt w:val="decimal"/>
       <w:lvlText w:val=""/>
       <w:lvlJc w:val="left"/>
     </w:lvl>
   </w:abstractNum>
   <w:abstractNum w:abstractNumId="1" w15:restartNumberingAfterBreak="0">
-    <w:nsid w:val="21AA37DE"/>
+    <w:nsid w:val="36D54BDC"/>
     <w:multiLevelType w:val="hybridMultilevel"/>
-    <w:tmpl w:val="1F94F1CE"/>
-    <w:lvl w:ilvl="0" w:tplc="FC0C11EC">
+    <w:tmpl w:val="1F7C1EC2"/>
+    <w:lvl w:ilvl="0" w:tplc="7604E08C">
+      <w:start w:val="1"/>
+      <w:numFmt w:val="bullet"/>
+      <w:lvlText w:val="●"/>
+      <w:lvlJc w:val="left"/>
+      <w:pPr>
+        <w:ind w:left="720" w:hanging="360"/>
+      </w:pPr>
+    </w:lvl>
+    <w:lvl w:ilvl="1" w:tplc="EE200364">
+      <w:start w:val="1"/>
+      <w:numFmt w:val="bullet"/>
+      <w:lvlText w:val="○"/>
+      <w:lvlJc w:val="left"/>
+      <w:pPr>
+        <w:ind w:left="1440" w:hanging="360"/>
+      </w:pPr>
+    </w:lvl>
+    <w:lvl w:ilvl="2" w:tplc="94643476">
+      <w:start w:val="1"/>
+      <w:numFmt w:val="bullet"/>
+      <w:lvlText w:val="■"/>
+      <w:lvlJc w:val="left"/>
+      <w:pPr>
+        <w:ind w:left="2160" w:hanging="360"/>
+      </w:pPr>
+    </w:lvl>
+    <w:lvl w:ilvl="3" w:tplc="DF64A266">
+      <w:start w:val="1"/>
+      <w:numFmt w:val="bullet"/>
+      <w:lvlText w:val="●"/>
+      <w:lvlJc w:val="left"/>
+      <w:pPr>
+        <w:ind w:left="2880" w:hanging="360"/>
+      </w:pPr>
+    </w:lvl>
+    <w:lvl w:ilvl="4" w:tplc="A07E9D92">
+      <w:start w:val="1"/>
+      <w:numFmt w:val="bullet"/>
+      <w:lvlText w:val="○"/>
+      <w:lvlJc w:val="left"/>
+      <w:pPr>
+        <w:ind w:left="3600" w:hanging="360"/>
+      </w:pPr>
+    </w:lvl>
+    <w:lvl w:ilvl="5" w:tplc="80F235CA">
+      <w:start w:val="1"/>
+      <w:numFmt w:val="bullet"/>
+      <w:lvlText w:val="■"/>
+      <w:lvlJc w:val="left"/>
+      <w:pPr>
+        <w:ind w:left="4320" w:hanging="360"/>
+      </w:pPr>
+    </w:lvl>
+    <w:lvl w:ilvl="6" w:tplc="CC9C022A">
+      <w:start w:val="1"/>
+      <w:numFmt w:val="bullet"/>
+      <w:lvlText w:val="●"/>
+      <w:lvlJc w:val="left"/>
+      <w:pPr>
+        <w:ind w:left="5040" w:hanging="360"/>
+      </w:pPr>
+    </w:lvl>
+    <w:lvl w:ilvl="7" w:tplc="7E4C92EC">
+      <w:start w:val="1"/>
+      <w:numFmt w:val="bullet"/>
+      <w:lvlText w:val="●"/>
+      <w:lvlJc w:val="left"/>
+      <w:pPr>
+        <w:ind w:left="5760" w:hanging="360"/>
+      </w:pPr>
+    </w:lvl>
+    <w:lvl w:ilvl="8" w:tplc="07EE7E7C">
+      <w:start w:val="1"/>
+      <w:numFmt w:val="bullet"/>
+      <w:lvlText w:val="●"/>
+      <w:lvlJc w:val="left"/>
+      <w:pPr>
+        <w:ind w:left="6480" w:hanging="360"/>
+      </w:pPr>
+    </w:lvl>
+  </w:abstractNum>
+  <w:abstractNum w:abstractNumId="2" w15:restartNumberingAfterBreak="0">
+    <w:nsid w:val="38083BDB"/>
+    <w:multiLevelType w:val="hybridMultilevel"/>
+    <w:tmpl w:val="102CAC0C"/>
+    <w:lvl w:ilvl="0" w:tplc="DDAA61C4">
       <w:start w:val="1"/>
       <w:numFmt w:val="decimal"/>
       <w:lvlText w:val="步驟 %1."/>
@@ -35369,138 +35455,110 @@
         <w:color w:val="0A5BD3"/>
       </w:rPr>
     </w:lvl>
-    <w:lvl w:ilvl="1" w:tplc="0F8858BA">
+    <w:lvl w:ilvl="1" w:tplc="2A72D78E">
       <w:numFmt w:val="decimal"/>
       <w:lvlText w:val=""/>
       <w:lvlJc w:val="left"/>
     </w:lvl>
-    <w:lvl w:ilvl="2" w:tplc="52E6C58C">
+    <w:lvl w:ilvl="2" w:tplc="20548D84">
       <w:numFmt w:val="decimal"/>
       <w:lvlText w:val=""/>
       <w:lvlJc w:val="left"/>
     </w:lvl>
-    <w:lvl w:ilvl="3" w:tplc="3A1A82D8">
+    <w:lvl w:ilvl="3" w:tplc="A1DE34A4">
       <w:numFmt w:val="decimal"/>
       <w:lvlText w:val=""/>
       <w:lvlJc w:val="left"/>
     </w:lvl>
-    <w:lvl w:ilvl="4" w:tplc="0EDC8720">
+    <w:lvl w:ilvl="4" w:tplc="EBD271B0">
       <w:numFmt w:val="decimal"/>
       <w:lvlText w:val=""/>
       <w:lvlJc w:val="left"/>
     </w:lvl>
-    <w:lvl w:ilvl="5" w:tplc="64046C78">
+    <w:lvl w:ilvl="5" w:tplc="E93888D2">
       <w:numFmt w:val="decimal"/>
       <w:lvlText w:val=""/>
       <w:lvlJc w:val="left"/>
     </w:lvl>
-    <w:lvl w:ilvl="6" w:tplc="8E721DE0">
+    <w:lvl w:ilvl="6" w:tplc="6A7EC3E8">
       <w:numFmt w:val="decimal"/>
       <w:lvlText w:val=""/>
       <w:lvlJc w:val="left"/>
     </w:lvl>
-    <w:lvl w:ilvl="7" w:tplc="8102A184">
+    <w:lvl w:ilvl="7" w:tplc="10E20714">
       <w:numFmt w:val="decimal"/>
       <w:lvlText w:val=""/>
       <w:lvlJc w:val="left"/>
     </w:lvl>
-    <w:lvl w:ilvl="8" w:tplc="B4C20E18">
+    <w:lvl w:ilvl="8" w:tplc="CED09CE8">
       <w:numFmt w:val="decimal"/>
       <w:lvlText w:val=""/>
       <w:lvlJc w:val="left"/>
     </w:lvl>
   </w:abstractNum>
-  <w:abstractNum w:abstractNumId="2" w15:restartNumberingAfterBreak="0">
-    <w:nsid w:val="351E0B75"/>
+  <w:abstractNum w:abstractNumId="3" w15:restartNumberingAfterBreak="0">
+    <w:nsid w:val="47A544D6"/>
     <w:multiLevelType w:val="hybridMultilevel"/>
-    <w:tmpl w:val="C636C0F4"/>
-    <w:lvl w:ilvl="0" w:tplc="F934D8DC">
+    <w:tmpl w:val="20328F76"/>
+    <w:lvl w:ilvl="0" w:tplc="49582A0C">
       <w:start w:val="1"/>
       <w:numFmt w:val="bullet"/>
-      <w:lvlText w:val="●"/>
+      <w:lvlText w:val="•"/>
       <w:lvlJc w:val="left"/>
       <w:pPr>
-        <w:ind w:left="720" w:hanging="360"/>
+        <w:ind w:left="540" w:hanging="300"/>
       </w:pPr>
     </w:lvl>
-    <w:lvl w:ilvl="1" w:tplc="0C28DB0E">
+    <w:lvl w:ilvl="1" w:tplc="5BA2E968">
       <w:start w:val="1"/>
       <w:numFmt w:val="bullet"/>
-      <w:lvlText w:val="○"/>
+      <w:lvlText w:val="–"/>
       <w:lvlJc w:val="left"/>
       <w:pPr>
-        <w:ind w:left="1440" w:hanging="360"/>
+        <w:ind w:left="1260" w:hanging="300"/>
       </w:pPr>
     </w:lvl>
-    <w:lvl w:ilvl="2" w:tplc="2B12B1FA">
-      <w:start w:val="1"/>
-      <w:numFmt w:val="bullet"/>
-      <w:lvlText w:val="■"/>
+    <w:lvl w:ilvl="2" w:tplc="F3F0E244">
+      <w:numFmt w:val="decimal"/>
+      <w:lvlText w:val=""/>
       <w:lvlJc w:val="left"/>
-      <w:pPr>
-        <w:ind w:left="2160" w:hanging="360"/>
-      </w:pPr>
     </w:lvl>
-    <w:lvl w:ilvl="3" w:tplc="5B0C7212">
-      <w:start w:val="1"/>
-      <w:numFmt w:val="bullet"/>
-      <w:lvlText w:val="●"/>
+    <w:lvl w:ilvl="3" w:tplc="0C404748">
+      <w:numFmt w:val="decimal"/>
+      <w:lvlText w:val=""/>
       <w:lvlJc w:val="left"/>
-      <w:pPr>
-        <w:ind w:left="2880" w:hanging="360"/>
-      </w:pPr>
     </w:lvl>
-    <w:lvl w:ilvl="4" w:tplc="784A26CA">
-      <w:start w:val="1"/>
-      <w:numFmt w:val="bullet"/>
-      <w:lvlText w:val="○"/>
+    <w:lvl w:ilvl="4" w:tplc="1042122C">
+      <w:numFmt w:val="decimal"/>
+      <w:lvlText w:val=""/>
       <w:lvlJc w:val="left"/>
-      <w:pPr>
-        <w:ind w:left="3600" w:hanging="360"/>
-      </w:pPr>
     </w:lvl>
-    <w:lvl w:ilvl="5" w:tplc="914A6860">
-      <w:start w:val="1"/>
-      <w:numFmt w:val="bullet"/>
-      <w:lvlText w:val="■"/>
+    <w:lvl w:ilvl="5" w:tplc="5F640CEC">
+      <w:numFmt w:val="decimal"/>
+      <w:lvlText w:val=""/>
       <w:lvlJc w:val="left"/>
-      <w:pPr>
-        <w:ind w:left="4320" w:hanging="360"/>
-      </w:pPr>
     </w:lvl>
-    <w:lvl w:ilvl="6" w:tplc="916C8246">
-      <w:start w:val="1"/>
-      <w:numFmt w:val="bullet"/>
-      <w:lvlText w:val="●"/>
+    <w:lvl w:ilvl="6" w:tplc="39CA6C24">
+      <w:numFmt w:val="decimal"/>
+      <w:lvlText w:val=""/>
       <w:lvlJc w:val="left"/>
-      <w:pPr>
-        <w:ind w:left="5040" w:hanging="360"/>
-      </w:pPr>
     </w:lvl>
-    <w:lvl w:ilvl="7" w:tplc="3FD413DE">
-      <w:start w:val="1"/>
-      <w:numFmt w:val="bullet"/>
-      <w:lvlText w:val="●"/>
+    <w:lvl w:ilvl="7" w:tplc="1A3E119E">
+      <w:numFmt w:val="decimal"/>
+      <w:lvlText w:val=""/>
       <w:lvlJc w:val="left"/>
-      <w:pPr>
-        <w:ind w:left="5760" w:hanging="360"/>
-      </w:pPr>
     </w:lvl>
-    <w:lvl w:ilvl="8" w:tplc="7FFA0FFC">
-      <w:start w:val="1"/>
-      <w:numFmt w:val="bullet"/>
-      <w:lvlText w:val="●"/>
+    <w:lvl w:ilvl="8" w:tplc="3E4AEAB6">
+      <w:numFmt w:val="decimal"/>
+      <w:lvlText w:val=""/>
       <w:lvlJc w:val="left"/>
-      <w:pPr>
-        <w:ind w:left="6480" w:hanging="360"/>
-      </w:pPr>
     </w:lvl>
   </w:abstractNum>
-  <w:abstractNum w:abstractNumId="3" w15:restartNumberingAfterBreak="0">
-    <w:nsid w:val="69052366"/>
+  <w:abstractNum w:abstractNumId="4" w15:restartNumberingAfterBreak="0">
+    <w:nsid w:val="5CE472AC"/>
     <w:multiLevelType w:val="hybridMultilevel"/>
-    <w:tmpl w:val="71CE5168"/>
-    <w:lvl w:ilvl="0" w:tplc="9AE6ED28">
+    <w:tmpl w:val="1A744960"/>
+    <w:lvl w:ilvl="0" w:tplc="6B06508C">
       <w:start w:val="1"/>
       <w:numFmt w:val="decimal"/>
       <w:lvlText w:val="步驟 %1."/>
@@ -35514,110 +35572,52 @@
         <w:color w:val="0A5BD3"/>
       </w:rPr>
     </w:lvl>
-    <w:lvl w:ilvl="1" w:tplc="DFF07904">
+    <w:lvl w:ilvl="1" w:tplc="6B74BBD4">
       <w:numFmt w:val="decimal"/>
       <w:lvlText w:val=""/>
       <w:lvlJc w:val="left"/>
     </w:lvl>
-    <w:lvl w:ilvl="2" w:tplc="2F0A0FE0">
+    <w:lvl w:ilvl="2" w:tplc="24261280">
       <w:numFmt w:val="decimal"/>
       <w:lvlText w:val=""/>
       <w:lvlJc w:val="left"/>
     </w:lvl>
-    <w:lvl w:ilvl="3" w:tplc="498A8E7C">
+    <w:lvl w:ilvl="3" w:tplc="17C0725E">
       <w:numFmt w:val="decimal"/>
       <w:lvlText w:val=""/>
       <w:lvlJc w:val="left"/>
     </w:lvl>
-    <w:lvl w:ilvl="4" w:tplc="C5529270">
+    <w:lvl w:ilvl="4" w:tplc="06EAB5C2">
       <w:numFmt w:val="decimal"/>
       <w:lvlText w:val=""/>
       <w:lvlJc w:val="left"/>
     </w:lvl>
-    <w:lvl w:ilvl="5" w:tplc="547A5556">
+    <w:lvl w:ilvl="5" w:tplc="4D3A3E84">
       <w:numFmt w:val="decimal"/>
       <w:lvlText w:val=""/>
       <w:lvlJc w:val="left"/>
     </w:lvl>
-    <w:lvl w:ilvl="6" w:tplc="4B464CFA">
+    <w:lvl w:ilvl="6" w:tplc="A844C93A">
       <w:numFmt w:val="decimal"/>
       <w:lvlText w:val=""/>
       <w:lvlJc w:val="left"/>
     </w:lvl>
-    <w:lvl w:ilvl="7" w:tplc="6EB80EB6">
+    <w:lvl w:ilvl="7" w:tplc="6FC446E0">
       <w:numFmt w:val="decimal"/>
       <w:lvlText w:val=""/>
       <w:lvlJc w:val="left"/>
     </w:lvl>
-    <w:lvl w:ilvl="8" w:tplc="C8281EC8">
-      <w:numFmt w:val="decimal"/>
-      <w:lvlText w:val=""/>
-      <w:lvlJc w:val="left"/>
-    </w:lvl>
-  </w:abstractNum>
-  <w:abstractNum w:abstractNumId="4" w15:restartNumberingAfterBreak="0">
-    <w:nsid w:val="6BE80251"/>
-    <w:multiLevelType w:val="hybridMultilevel"/>
-    <w:tmpl w:val="F3DE2766"/>
-    <w:lvl w:ilvl="0" w:tplc="F92A4CB6">
-      <w:start w:val="1"/>
-      <w:numFmt w:val="bullet"/>
-      <w:lvlText w:val="•"/>
-      <w:lvlJc w:val="left"/>
-      <w:pPr>
-        <w:ind w:left="540" w:hanging="300"/>
-      </w:pPr>
-    </w:lvl>
-    <w:lvl w:ilvl="1" w:tplc="392E0EBA">
-      <w:start w:val="1"/>
-      <w:numFmt w:val="bullet"/>
-      <w:lvlText w:val="–"/>
-      <w:lvlJc w:val="left"/>
-      <w:pPr>
-        <w:ind w:left="1260" w:hanging="300"/>
-      </w:pPr>
-    </w:lvl>
-    <w:lvl w:ilvl="2" w:tplc="63287C22">
-      <w:numFmt w:val="decimal"/>
-      <w:lvlText w:val=""/>
-      <w:lvlJc w:val="left"/>
-    </w:lvl>
-    <w:lvl w:ilvl="3" w:tplc="A9B631B4">
-      <w:numFmt w:val="decimal"/>
-      <w:lvlText w:val=""/>
-      <w:lvlJc w:val="left"/>
-    </w:lvl>
-    <w:lvl w:ilvl="4" w:tplc="28F8377C">
-      <w:numFmt w:val="decimal"/>
-      <w:lvlText w:val=""/>
-      <w:lvlJc w:val="left"/>
-    </w:lvl>
-    <w:lvl w:ilvl="5" w:tplc="EB92C45A">
-      <w:numFmt w:val="decimal"/>
-      <w:lvlText w:val=""/>
-      <w:lvlJc w:val="left"/>
-    </w:lvl>
-    <w:lvl w:ilvl="6" w:tplc="26EC7D34">
-      <w:numFmt w:val="decimal"/>
-      <w:lvlText w:val=""/>
-      <w:lvlJc w:val="left"/>
-    </w:lvl>
-    <w:lvl w:ilvl="7" w:tplc="B8D2EA56">
-      <w:numFmt w:val="decimal"/>
-      <w:lvlText w:val=""/>
-      <w:lvlJc w:val="left"/>
-    </w:lvl>
-    <w:lvl w:ilvl="8" w:tplc="A718D4CC">
+    <w:lvl w:ilvl="8" w:tplc="6AD042C4">
       <w:numFmt w:val="decimal"/>
       <w:lvlText w:val=""/>
       <w:lvlJc w:val="left"/>
     </w:lvl>
   </w:abstractNum>
   <w:abstractNum w:abstractNumId="5" w15:restartNumberingAfterBreak="0">
-    <w:nsid w:val="6D99541A"/>
+    <w:nsid w:val="60AC601A"/>
     <w:multiLevelType w:val="hybridMultilevel"/>
-    <w:tmpl w:val="5F444E84"/>
-    <w:lvl w:ilvl="0" w:tplc="AEA6B75C">
+    <w:tmpl w:val="0B62336A"/>
+    <w:lvl w:ilvl="0" w:tplc="C9042376">
       <w:start w:val="1"/>
       <w:numFmt w:val="decimal"/>
       <w:lvlText w:val="步驟 %1."/>
@@ -35631,52 +35631,52 @@
         <w:color w:val="0A5BD3"/>
       </w:rPr>
     </w:lvl>
-    <w:lvl w:ilvl="1" w:tplc="DF685C3A">
+    <w:lvl w:ilvl="1" w:tplc="BD8ACAFA">
       <w:numFmt w:val="decimal"/>
       <w:lvlText w:val=""/>
       <w:lvlJc w:val="left"/>
     </w:lvl>
-    <w:lvl w:ilvl="2" w:tplc="ABD469A6">
+    <w:lvl w:ilvl="2" w:tplc="94F05590">
       <w:numFmt w:val="decimal"/>
       <w:lvlText w:val=""/>
       <w:lvlJc w:val="left"/>
     </w:lvl>
-    <w:lvl w:ilvl="3" w:tplc="99AC0380">
+    <w:lvl w:ilvl="3" w:tplc="D26ADC3E">
       <w:numFmt w:val="decimal"/>
       <w:lvlText w:val=""/>
       <w:lvlJc w:val="left"/>
     </w:lvl>
-    <w:lvl w:ilvl="4" w:tplc="C3C4E918">
+    <w:lvl w:ilvl="4" w:tplc="D2E2AE16">
       <w:numFmt w:val="decimal"/>
       <w:lvlText w:val=""/>
       <w:lvlJc w:val="left"/>
     </w:lvl>
-    <w:lvl w:ilvl="5" w:tplc="D68A04B8">
+    <w:lvl w:ilvl="5" w:tplc="35C2D50C">
       <w:numFmt w:val="decimal"/>
       <w:lvlText w:val=""/>
       <w:lvlJc w:val="left"/>
     </w:lvl>
-    <w:lvl w:ilvl="6" w:tplc="6AA233C4">
+    <w:lvl w:ilvl="6" w:tplc="CF464C02">
       <w:numFmt w:val="decimal"/>
       <w:lvlText w:val=""/>
       <w:lvlJc w:val="left"/>
     </w:lvl>
-    <w:lvl w:ilvl="7" w:tplc="33A47CBE">
+    <w:lvl w:ilvl="7" w:tplc="42DC692A">
       <w:numFmt w:val="decimal"/>
       <w:lvlText w:val=""/>
       <w:lvlJc w:val="left"/>
     </w:lvl>
-    <w:lvl w:ilvl="8" w:tplc="03E6E070">
+    <w:lvl w:ilvl="8" w:tplc="CB563306">
       <w:numFmt w:val="decimal"/>
       <w:lvlText w:val=""/>
       <w:lvlJc w:val="left"/>
     </w:lvl>
   </w:abstractNum>
   <w:abstractNum w:abstractNumId="6" w15:restartNumberingAfterBreak="0">
-    <w:nsid w:val="71843335"/>
+    <w:nsid w:val="698B56D9"/>
     <w:multiLevelType w:val="hybridMultilevel"/>
-    <w:tmpl w:val="53A8DCB2"/>
-    <w:lvl w:ilvl="0" w:tplc="4E9C3CD2">
+    <w:tmpl w:val="FDBCA654"/>
+    <w:lvl w:ilvl="0" w:tplc="5524A752">
       <w:start w:val="1"/>
       <w:numFmt w:val="decimal"/>
       <w:lvlText w:val="步驟 %1."/>
@@ -35690,52 +35690,52 @@
         <w:color w:val="0A5BD3"/>
       </w:rPr>
     </w:lvl>
-    <w:lvl w:ilvl="1" w:tplc="972A8F90">
+    <w:lvl w:ilvl="1" w:tplc="87D2158A">
       <w:numFmt w:val="decimal"/>
       <w:lvlText w:val=""/>
       <w:lvlJc w:val="left"/>
     </w:lvl>
-    <w:lvl w:ilvl="2" w:tplc="301E66EA">
+    <w:lvl w:ilvl="2" w:tplc="B164C2EA">
       <w:numFmt w:val="decimal"/>
       <w:lvlText w:val=""/>
       <w:lvlJc w:val="left"/>
     </w:lvl>
-    <w:lvl w:ilvl="3" w:tplc="8A2E856C">
+    <w:lvl w:ilvl="3" w:tplc="227AF71A">
       <w:numFmt w:val="decimal"/>
       <w:lvlText w:val=""/>
       <w:lvlJc w:val="left"/>
     </w:lvl>
-    <w:lvl w:ilvl="4" w:tplc="E99819F0">
+    <w:lvl w:ilvl="4" w:tplc="2A66F08E">
       <w:numFmt w:val="decimal"/>
       <w:lvlText w:val=""/>
       <w:lvlJc w:val="left"/>
     </w:lvl>
-    <w:lvl w:ilvl="5" w:tplc="7F067B50">
+    <w:lvl w:ilvl="5" w:tplc="1C16FC02">
       <w:numFmt w:val="decimal"/>
       <w:lvlText w:val=""/>
       <w:lvlJc w:val="left"/>
     </w:lvl>
-    <w:lvl w:ilvl="6" w:tplc="38741680">
+    <w:lvl w:ilvl="6" w:tplc="A41AF4DC">
       <w:numFmt w:val="decimal"/>
       <w:lvlText w:val=""/>
       <w:lvlJc w:val="left"/>
     </w:lvl>
-    <w:lvl w:ilvl="7" w:tplc="933ABD04">
+    <w:lvl w:ilvl="7" w:tplc="2564B34E">
       <w:numFmt w:val="decimal"/>
       <w:lvlText w:val=""/>
       <w:lvlJc w:val="left"/>
     </w:lvl>
-    <w:lvl w:ilvl="8" w:tplc="B3F89F2C">
+    <w:lvl w:ilvl="8" w:tplc="5008D2F2">
       <w:numFmt w:val="decimal"/>
       <w:lvlText w:val=""/>
       <w:lvlJc w:val="left"/>
     </w:lvl>
   </w:abstractNum>
   <w:abstractNum w:abstractNumId="7" w15:restartNumberingAfterBreak="0">
-    <w:nsid w:val="7231157C"/>
+    <w:nsid w:val="7C6B748B"/>
     <w:multiLevelType w:val="hybridMultilevel"/>
-    <w:tmpl w:val="BC988F6C"/>
-    <w:lvl w:ilvl="0" w:tplc="C38E9F18">
+    <w:tmpl w:val="9C063F0E"/>
+    <w:lvl w:ilvl="0" w:tplc="7C8C93E6">
       <w:start w:val="1"/>
       <w:numFmt w:val="decimal"/>
       <w:lvlText w:val="步驟 %1."/>
@@ -35749,91 +35749,91 @@
         <w:color w:val="0A5BD3"/>
       </w:rPr>
     </w:lvl>
-    <w:lvl w:ilvl="1" w:tplc="C2189742">
+    <w:lvl w:ilvl="1" w:tplc="4EDCB800">
       <w:numFmt w:val="decimal"/>
       <w:lvlText w:val=""/>
       <w:lvlJc w:val="left"/>
     </w:lvl>
-    <w:lvl w:ilvl="2" w:tplc="3BE89B5C">
+    <w:lvl w:ilvl="2" w:tplc="8CF28CAE">
       <w:numFmt w:val="decimal"/>
       <w:lvlText w:val=""/>
       <w:lvlJc w:val="left"/>
     </w:lvl>
-    <w:lvl w:ilvl="3" w:tplc="B73C1D62">
+    <w:lvl w:ilvl="3" w:tplc="5EB4B7E0">
       <w:numFmt w:val="decimal"/>
       <w:lvlText w:val=""/>
       <w:lvlJc w:val="left"/>
     </w:lvl>
-    <w:lvl w:ilvl="4" w:tplc="C4068D18">
+    <w:lvl w:ilvl="4" w:tplc="BE38E332">
       <w:numFmt w:val="decimal"/>
       <w:lvlText w:val=""/>
       <w:lvlJc w:val="left"/>
     </w:lvl>
-    <w:lvl w:ilvl="5" w:tplc="4CDC066A">
+    <w:lvl w:ilvl="5" w:tplc="870C520E">
       <w:numFmt w:val="decimal"/>
       <w:lvlText w:val=""/>
       <w:lvlJc w:val="left"/>
     </w:lvl>
-    <w:lvl w:ilvl="6" w:tplc="7738318A">
+    <w:lvl w:ilvl="6" w:tplc="6234D318">
       <w:numFmt w:val="decimal"/>
       <w:lvlText w:val=""/>
       <w:lvlJc w:val="left"/>
     </w:lvl>
-    <w:lvl w:ilvl="7" w:tplc="09541678">
+    <w:lvl w:ilvl="7" w:tplc="01B619EE">
       <w:numFmt w:val="decimal"/>
       <w:lvlText w:val=""/>
       <w:lvlJc w:val="left"/>
     </w:lvl>
-    <w:lvl w:ilvl="8" w:tplc="47223F3C">
+    <w:lvl w:ilvl="8" w:tplc="3788EF4C">
       <w:numFmt w:val="decimal"/>
       <w:lvlText w:val=""/>
       <w:lvlJc w:val="left"/>
     </w:lvl>
   </w:abstractNum>
-  <w:num w:numId="1" w16cid:durableId="517238030">
+  <w:num w:numId="1" w16cid:durableId="1901940826">
+    <w:abstractNumId w:val="1"/>
+    <w:lvlOverride w:ilvl="0">
+      <w:startOverride w:val="1"/>
+    </w:lvlOverride>
+  </w:num>
+  <w:num w:numId="2" w16cid:durableId="1263686323">
+    <w:abstractNumId w:val="3"/>
+    <w:lvlOverride w:ilvl="0">
+      <w:startOverride w:val="1"/>
+    </w:lvlOverride>
+  </w:num>
+  <w:num w:numId="3" w16cid:durableId="1846436281">
+    <w:abstractNumId w:val="0"/>
+    <w:lvlOverride w:ilvl="0">
+      <w:startOverride w:val="1"/>
+    </w:lvlOverride>
+  </w:num>
+  <w:num w:numId="4" w16cid:durableId="1058474844">
     <w:abstractNumId w:val="2"/>
     <w:lvlOverride w:ilvl="0">
       <w:startOverride w:val="1"/>
     </w:lvlOverride>
   </w:num>
-  <w:num w:numId="2" w16cid:durableId="1139834551">
+  <w:num w:numId="5" w16cid:durableId="1669285543">
+    <w:abstractNumId w:val="7"/>
+    <w:lvlOverride w:ilvl="0">
+      <w:startOverride w:val="1"/>
+    </w:lvlOverride>
+  </w:num>
+  <w:num w:numId="6" w16cid:durableId="986973738">
+    <w:abstractNumId w:val="6"/>
+    <w:lvlOverride w:ilvl="0">
+      <w:startOverride w:val="1"/>
+    </w:lvlOverride>
+  </w:num>
+  <w:num w:numId="7" w16cid:durableId="804355130">
     <w:abstractNumId w:val="4"/>
     <w:lvlOverride w:ilvl="0">
       <w:startOverride w:val="1"/>
     </w:lvlOverride>
   </w:num>
-  <w:num w:numId="3" w16cid:durableId="450515693">
+  <w:num w:numId="8" w16cid:durableId="509879999">
     <w:abstractNumId w:val="5"/>
-    <w:lvlOverride w:ilvl="0">
-      <w:startOverride w:val="1"/>
-    </w:lvlOverride>
-  </w:num>
-  <w:num w:numId="4" w16cid:durableId="321743205">
-    <w:abstractNumId w:val="0"/>
-    <w:lvlOverride w:ilvl="0">
-      <w:startOverride w:val="1"/>
-    </w:lvlOverride>
-  </w:num>
-  <w:num w:numId="5" w16cid:durableId="1099642421">
-    <w:abstractNumId w:val="6"/>
-    <w:lvlOverride w:ilvl="0">
-      <w:startOverride w:val="1"/>
-    </w:lvlOverride>
-  </w:num>
-  <w:num w:numId="6" w16cid:durableId="533925510">
-    <w:abstractNumId w:val="3"/>
-    <w:lvlOverride w:ilvl="0">
-      <w:startOverride w:val="1"/>
-    </w:lvlOverride>
-  </w:num>
-  <w:num w:numId="7" w16cid:durableId="1039746687">
-    <w:abstractNumId w:val="1"/>
-    <w:lvlOverride w:ilvl="0">
-      <w:startOverride w:val="1"/>
-    </w:lvlOverride>
-  </w:num>
-  <w:num w:numId="8" w16cid:durableId="559172702">
-    <w:abstractNumId w:val="7"/>
     <w:lvlOverride w:ilvl="0">
       <w:startOverride w:val="1"/>
     </w:lvlOverride>
@@ -36456,7 +36456,7 @@
     <w:link w:val="aa"/>
     <w:uiPriority w:val="99"/>
     <w:unhideWhenUsed/>
-    <w:rsid w:val="0022624C"/>
+    <w:rsid w:val="005131EC"/>
     <w:pPr>
       <w:tabs>
         <w:tab w:val="center" w:pos="4153"/>
@@ -36474,7 +36474,7 @@
     <w:basedOn w:val="a0"/>
     <w:link w:val="a9"/>
     <w:uiPriority w:val="99"/>
-    <w:rsid w:val="0022624C"/>
+    <w:rsid w:val="005131EC"/>
     <w:rPr>
       <w:sz w:val="20"/>
       <w:szCs w:val="20"/>
@@ -36486,7 +36486,7 @@
     <w:link w:val="ac"/>
     <w:uiPriority w:val="99"/>
     <w:unhideWhenUsed/>
-    <w:rsid w:val="0022624C"/>
+    <w:rsid w:val="005131EC"/>
     <w:pPr>
       <w:tabs>
         <w:tab w:val="center" w:pos="4153"/>
@@ -36504,7 +36504,7 @@
     <w:basedOn w:val="a0"/>
     <w:link w:val="ab"/>
     <w:uiPriority w:val="99"/>
-    <w:rsid w:val="0022624C"/>
+    <w:rsid w:val="005131EC"/>
     <w:rPr>
       <w:sz w:val="20"/>
       <w:szCs w:val="20"/>

</xml_diff>